<commit_message>
finalized week 9 log from auditing
</commit_message>
<xml_diff>
--- a/Weekly Logs/Matt/Matt Baker - Week 10 Individual Logbook.docx
+++ b/Weekly Logs/Matt/Matt Baker - Week 10 Individual Logbook.docx
@@ -2545,6 +2545,16 @@
       <w:bookmarkEnd w:id="2"/>
     </w:p>
     <w:p>
+      <w:r>
+        <w:t xml:space="preserve">9:00 – </w:t>
+      </w:r>
+    </w:p>
+    <w:p>
+      <w:r>
+        <w:t>Audited logs, discussed who would discuss each slide, did a test run through presentation</w:t>
+      </w:r>
+    </w:p>
+    <w:p>
       <w:pPr>
         <w:ind w:left="0" w:firstLine="0"/>
         <w:rPr>
@@ -2593,43 +2603,7 @@
           <w:color w:val="000000"/>
           <w:sz w:val="22"/>
         </w:rPr>
-        <w:t xml:space="preserve">Bryce went over our presentation, gave us some advice for each section, we discussed the inclusion of recent developments of </w:t>
-      </w:r>
-      <w:proofErr w:type="spellStart"/>
-      <w:r>
-        <w:rPr>
-          <w:rStyle w:val="Heading2Char"/>
-          <w:color w:val="000000"/>
-          <w:sz w:val="22"/>
-        </w:rPr>
-        <w:t>nMap</w:t>
-      </w:r>
-      <w:proofErr w:type="spellEnd"/>
-      <w:r>
-        <w:rPr>
-          <w:rStyle w:val="Heading2Char"/>
-          <w:color w:val="000000"/>
-          <w:sz w:val="22"/>
-        </w:rPr>
-        <w:t xml:space="preserve"> script, when and how he might demonstrate/share his existing solution of an AI-augmented </w:t>
-      </w:r>
-      <w:proofErr w:type="spellStart"/>
-      <w:r>
-        <w:rPr>
-          <w:rStyle w:val="Heading2Char"/>
-          <w:color w:val="000000"/>
-          <w:sz w:val="22"/>
-        </w:rPr>
-        <w:t>nMap</w:t>
-      </w:r>
-      <w:proofErr w:type="spellEnd"/>
-      <w:r>
-        <w:rPr>
-          <w:rStyle w:val="Heading2Char"/>
-          <w:color w:val="000000"/>
-          <w:sz w:val="22"/>
-        </w:rPr>
-        <w:t xml:space="preserve"> analysis script.</w:t>
+        <w:t>Bryce went over our presentation, gave us some advice for each section, we discussed the inclusion of recent developments of nMap script, when and how he might demonstrate/share his existing solution of an AI-augmented nMap analysis script.</w:t>
       </w:r>
       <w:r>
         <w:rPr>

</xml_diff>

<commit_message>
added scripts folder, updated logs
</commit_message>
<xml_diff>
--- a/Weekly Logs/Matt/Matt Baker - Week 10 Individual Logbook.docx
+++ b/Weekly Logs/Matt/Matt Baker - Week 10 Individual Logbook.docx
@@ -913,7 +913,7 @@
           <w:r>
             <w:fldChar w:fldCharType="separate"/>
           </w:r>
-          <w:hyperlink w:anchor="_Toc240221601" w:history="1">
+          <w:hyperlink w:anchor="_Toc240451462" w:history="1">
             <w:r>
               <w:rPr>
                 <w:rStyle w:val="Hyperlink"/>
@@ -940,7 +940,7 @@
                 <w:noProof/>
                 <w:webHidden/>
               </w:rPr>
-              <w:instrText xml:space="preserve"> PAGEREF _Toc240221601 \h </w:instrText>
+              <w:instrText xml:space="preserve"> PAGEREF _Toc240451462 \h </w:instrText>
             </w:r>
             <w:r>
               <w:rPr>
@@ -984,7 +984,7 @@
               <w:sz w:val="24"/>
             </w:rPr>
           </w:pPr>
-          <w:hyperlink w:anchor="_Toc240221602" w:history="1">
+          <w:hyperlink w:anchor="_Toc240451463" w:history="1">
             <w:r>
               <w:rPr>
                 <w:rStyle w:val="Hyperlink"/>
@@ -1011,7 +1011,7 @@
                 <w:noProof/>
                 <w:webHidden/>
               </w:rPr>
-              <w:instrText xml:space="preserve"> PAGEREF _Toc240221602 \h </w:instrText>
+              <w:instrText xml:space="preserve"> PAGEREF _Toc240451463 \h </w:instrText>
             </w:r>
             <w:r>
               <w:rPr>
@@ -1055,7 +1055,7 @@
               <w:sz w:val="24"/>
             </w:rPr>
           </w:pPr>
-          <w:hyperlink w:anchor="_Toc240221603" w:history="1">
+          <w:hyperlink w:anchor="_Toc240451464" w:history="1">
             <w:r>
               <w:rPr>
                 <w:rStyle w:val="Hyperlink"/>
@@ -1082,7 +1082,7 @@
                 <w:noProof/>
                 <w:webHidden/>
               </w:rPr>
-              <w:instrText xml:space="preserve"> PAGEREF _Toc240221603 \h </w:instrText>
+              <w:instrText xml:space="preserve"> PAGEREF _Toc240451464 \h </w:instrText>
             </w:r>
             <w:r>
               <w:rPr>
@@ -1126,7 +1126,7 @@
               <w:sz w:val="24"/>
             </w:rPr>
           </w:pPr>
-          <w:hyperlink w:anchor="_Toc240221604" w:history="1">
+          <w:hyperlink w:anchor="_Toc240451465" w:history="1">
             <w:r>
               <w:rPr>
                 <w:rStyle w:val="Hyperlink"/>
@@ -1153,7 +1153,7 @@
                 <w:noProof/>
                 <w:webHidden/>
               </w:rPr>
-              <w:instrText xml:space="preserve"> PAGEREF _Toc240221604 \h </w:instrText>
+              <w:instrText xml:space="preserve"> PAGEREF _Toc240451465 \h </w:instrText>
             </w:r>
             <w:r>
               <w:rPr>
@@ -1197,13 +1197,13 @@
               <w:sz w:val="24"/>
             </w:rPr>
           </w:pPr>
-          <w:hyperlink w:anchor="_Toc240221605" w:history="1">
+          <w:hyperlink w:anchor="_Toc240451466" w:history="1">
             <w:r>
               <w:rPr>
                 <w:rStyle w:val="Hyperlink"/>
                 <w:noProof/>
               </w:rPr>
-              <w:t>Client Meetings</w:t>
+              <w:t>Monday, September 14th</w:t>
             </w:r>
             <w:r>
               <w:rPr>
@@ -1224,7 +1224,7 @@
                 <w:noProof/>
                 <w:webHidden/>
               </w:rPr>
-              <w:instrText xml:space="preserve"> PAGEREF _Toc240221605 \h </w:instrText>
+              <w:instrText xml:space="preserve"> PAGEREF _Toc240451466 \h </w:instrText>
             </w:r>
             <w:r>
               <w:rPr>
@@ -1268,13 +1268,13 @@
               <w:sz w:val="24"/>
             </w:rPr>
           </w:pPr>
-          <w:hyperlink w:anchor="_Toc240221606" w:history="1">
+          <w:hyperlink w:anchor="_Toc240451467" w:history="1">
             <w:r>
               <w:rPr>
                 <w:rStyle w:val="Hyperlink"/>
                 <w:noProof/>
               </w:rPr>
-              <w:t>Research</w:t>
+              <w:t>Client Meetings</w:t>
             </w:r>
             <w:r>
               <w:rPr>
@@ -1295,7 +1295,7 @@
                 <w:noProof/>
                 <w:webHidden/>
               </w:rPr>
-              <w:instrText xml:space="preserve"> PAGEREF _Toc240221606 \h </w:instrText>
+              <w:instrText xml:space="preserve"> PAGEREF _Toc240451467 \h </w:instrText>
             </w:r>
             <w:r>
               <w:rPr>
@@ -1315,7 +1315,7 @@
                 <w:noProof/>
                 <w:webHidden/>
               </w:rPr>
-              <w:t>4</w:t>
+              <w:t>3</w:t>
             </w:r>
             <w:r>
               <w:rPr>
@@ -1339,13 +1339,13 @@
               <w:sz w:val="24"/>
             </w:rPr>
           </w:pPr>
-          <w:hyperlink w:anchor="_Toc240221607" w:history="1">
+          <w:hyperlink w:anchor="_Toc240451468" w:history="1">
             <w:r>
               <w:rPr>
                 <w:rStyle w:val="Hyperlink"/>
                 <w:noProof/>
               </w:rPr>
-              <w:t>Documentation</w:t>
+              <w:t>Research</w:t>
             </w:r>
             <w:r>
               <w:rPr>
@@ -1366,7 +1366,7 @@
                 <w:noProof/>
                 <w:webHidden/>
               </w:rPr>
-              <w:instrText xml:space="preserve"> PAGEREF _Toc240221607 \h </w:instrText>
+              <w:instrText xml:space="preserve"> PAGEREF _Toc240451468 \h </w:instrText>
             </w:r>
             <w:r>
               <w:rPr>
@@ -1386,7 +1386,7 @@
                 <w:noProof/>
                 <w:webHidden/>
               </w:rPr>
-              <w:t>4</w:t>
+              <w:t>3</w:t>
             </w:r>
             <w:r>
               <w:rPr>
@@ -1410,13 +1410,13 @@
               <w:sz w:val="24"/>
             </w:rPr>
           </w:pPr>
-          <w:hyperlink w:anchor="_Toc240221608" w:history="1">
+          <w:hyperlink w:anchor="_Toc240451469" w:history="1">
             <w:r>
               <w:rPr>
                 <w:rStyle w:val="Hyperlink"/>
                 <w:noProof/>
               </w:rPr>
-              <w:t>Testing</w:t>
+              <w:t>Documentation</w:t>
             </w:r>
             <w:r>
               <w:rPr>
@@ -1437,7 +1437,7 @@
                 <w:noProof/>
                 <w:webHidden/>
               </w:rPr>
-              <w:instrText xml:space="preserve"> PAGEREF _Toc240221608 \h </w:instrText>
+              <w:instrText xml:space="preserve"> PAGEREF _Toc240451469 \h </w:instrText>
             </w:r>
             <w:r>
               <w:rPr>
@@ -1457,7 +1457,7 @@
                 <w:noProof/>
                 <w:webHidden/>
               </w:rPr>
-              <w:t>4</w:t>
+              <w:t>3</w:t>
             </w:r>
             <w:r>
               <w:rPr>
@@ -1481,12 +1481,83 @@
               <w:sz w:val="24"/>
             </w:rPr>
           </w:pPr>
-          <w:hyperlink w:anchor="_Toc240221609" w:history="1">
+          <w:hyperlink w:anchor="_Toc240451470" w:history="1">
             <w:r>
               <w:rPr>
                 <w:rStyle w:val="Hyperlink"/>
                 <w:noProof/>
               </w:rPr>
+              <w:t>Testing</w:t>
+            </w:r>
+            <w:r>
+              <w:rPr>
+                <w:noProof/>
+                <w:webHidden/>
+              </w:rPr>
+              <w:tab/>
+            </w:r>
+            <w:r>
+              <w:rPr>
+                <w:noProof/>
+                <w:webHidden/>
+              </w:rPr>
+              <w:fldChar w:fldCharType="begin"/>
+            </w:r>
+            <w:r>
+              <w:rPr>
+                <w:noProof/>
+                <w:webHidden/>
+              </w:rPr>
+              <w:instrText xml:space="preserve"> PAGEREF _Toc240451470 \h </w:instrText>
+            </w:r>
+            <w:r>
+              <w:rPr>
+                <w:noProof/>
+                <w:webHidden/>
+              </w:rPr>
+            </w:r>
+            <w:r>
+              <w:rPr>
+                <w:noProof/>
+                <w:webHidden/>
+              </w:rPr>
+              <w:fldChar w:fldCharType="separate"/>
+            </w:r>
+            <w:r>
+              <w:rPr>
+                <w:noProof/>
+                <w:webHidden/>
+              </w:rPr>
+              <w:t>4</w:t>
+            </w:r>
+            <w:r>
+              <w:rPr>
+                <w:noProof/>
+                <w:webHidden/>
+              </w:rPr>
+              <w:fldChar w:fldCharType="end"/>
+            </w:r>
+          </w:hyperlink>
+        </w:p>
+        <w:p>
+          <w:pPr>
+            <w:pStyle w:val="TOC2"/>
+            <w:tabs>
+              <w:tab w:val="right" w:leader="dot" w:pos="9013"/>
+            </w:tabs>
+            <w:rPr>
+              <w:rFonts w:asciiTheme="minorHAnsi" w:eastAsiaTheme="minorEastAsia" w:hAnsiTheme="minorHAnsi" w:cstheme="minorBidi"/>
+              <w:noProof/>
+              <w:color w:val="auto"/>
+              <w:sz w:val="24"/>
+            </w:rPr>
+          </w:pPr>
+          <w:hyperlink w:anchor="_Toc240451471" w:history="1">
+            <w:r>
+              <w:rPr>
+                <w:rStyle w:val="Hyperlink"/>
+                <w:noProof/>
+              </w:rPr>
               <w:t>Development</w:t>
             </w:r>
             <w:r>
@@ -1508,7 +1579,7 @@
                 <w:noProof/>
                 <w:webHidden/>
               </w:rPr>
-              <w:instrText xml:space="preserve"> PAGEREF _Toc240221609 \h </w:instrText>
+              <w:instrText xml:space="preserve"> PAGEREF _Toc240451471 \h </w:instrText>
             </w:r>
             <w:r>
               <w:rPr>
@@ -1528,7 +1599,7 @@
                 <w:noProof/>
                 <w:webHidden/>
               </w:rPr>
-              <w:t>10</w:t>
+              <w:t>4</w:t>
             </w:r>
             <w:r>
               <w:rPr>
@@ -1701,36 +1772,6 @@
     <w:p>
       <w:pPr>
         <w:spacing w:after="0" w:line="259" w:lineRule="auto"/>
-        <w:ind w:left="725" w:firstLine="0"/>
-      </w:pPr>
-    </w:p>
-    <w:p>
-      <w:pPr>
-        <w:spacing w:after="0" w:line="259" w:lineRule="auto"/>
-        <w:ind w:left="725" w:firstLine="0"/>
-      </w:pPr>
-    </w:p>
-    <w:p>
-      <w:pPr>
-        <w:spacing w:after="0" w:line="259" w:lineRule="auto"/>
-        <w:ind w:left="725" w:firstLine="0"/>
-      </w:pPr>
-    </w:p>
-    <w:p>
-      <w:pPr>
-        <w:spacing w:after="0" w:line="259" w:lineRule="auto"/>
-        <w:ind w:left="725" w:firstLine="0"/>
-      </w:pPr>
-    </w:p>
-    <w:p>
-      <w:pPr>
-        <w:spacing w:after="0" w:line="259" w:lineRule="auto"/>
-        <w:ind w:left="725" w:firstLine="0"/>
-      </w:pPr>
-    </w:p>
-    <w:p>
-      <w:pPr>
-        <w:spacing w:after="0" w:line="259" w:lineRule="auto"/>
         <w:ind w:left="0" w:firstLine="0"/>
       </w:pPr>
     </w:p>
@@ -1739,7 +1780,7 @@
         <w:pStyle w:val="Heading1"/>
         <w:ind w:left="-5"/>
       </w:pPr>
-      <w:bookmarkStart w:id="0" w:name="_Toc240221601"/>
+      <w:bookmarkStart w:id="0" w:name="_Toc240451462"/>
       <w:r>
         <w:lastRenderedPageBreak/>
         <w:t>Hours Breakdown</w:t>
@@ -2524,7 +2565,7 @@
         <w:pStyle w:val="Heading1"/>
         <w:ind w:left="-5"/>
       </w:pPr>
-      <w:bookmarkStart w:id="1" w:name="_Toc240221602"/>
+      <w:bookmarkStart w:id="1" w:name="_Toc240451463"/>
       <w:r>
         <w:lastRenderedPageBreak/>
         <w:t>Completed Content/Documentation</w:t>
@@ -2535,7 +2576,7 @@
       <w:pPr>
         <w:pStyle w:val="Heading2"/>
       </w:pPr>
-      <w:bookmarkStart w:id="2" w:name="_Toc240221603"/>
+      <w:bookmarkStart w:id="2" w:name="_Toc240451464"/>
       <w:r>
         <w:t>Team Meeting</w:t>
       </w:r>
@@ -2546,12 +2587,71 @@
     </w:p>
     <w:p>
       <w:r>
-        <w:t xml:space="preserve">9:00 – </w:t>
-      </w:r>
-    </w:p>
-    <w:p>
-      <w:r>
-        <w:t>Audited logs, discussed who would discuss each slide, did a test run through presentation</w:t>
+        <w:t>Tuesday</w:t>
+      </w:r>
+      <w:r>
+        <w:t xml:space="preserve">, </w:t>
+      </w:r>
+      <w:r>
+        <w:t>September 15</w:t>
+      </w:r>
+      <w:r>
+        <w:rPr>
+          <w:vertAlign w:val="superscript"/>
+        </w:rPr>
+        <w:t>th</w:t>
+      </w:r>
+    </w:p>
+    <w:p>
+      <w:r>
+        <w:t>10</w:t>
+      </w:r>
+      <w:r>
+        <w:t xml:space="preserve">:00 – </w:t>
+      </w:r>
+      <w:r>
+        <w:t>2</w:t>
+      </w:r>
+      <w:r>
+        <w:t>:00</w:t>
+      </w:r>
+      <w:r>
+        <w:t>PM</w:t>
+      </w:r>
+      <w:r>
+        <w:t xml:space="preserve"> (</w:t>
+      </w:r>
+      <w:r>
+        <w:t>4</w:t>
+      </w:r>
+      <w:r>
+        <w:t>hrs)</w:t>
+      </w:r>
+    </w:p>
+    <w:p>
+      <w:r>
+        <w:t>Audited logs clarified exact meeting hours.</w:t>
+      </w:r>
+      <w:r>
+        <w:t xml:space="preserve"> </w:t>
+      </w:r>
+      <w:r>
+        <w:t>D</w:t>
+      </w:r>
+      <w:r>
+        <w:t>iscussed who would discuss each slide, did a test run through presentation</w:t>
+      </w:r>
+      <w:r>
+        <w:t>, managed the git repository somewhat. Sam mentioned that some “PrivSec” guys were interested in similar technology to that which we are investigating/producing.</w:t>
+      </w:r>
+      <w:r>
+        <w:t xml:space="preserve"> We collectively refined the presentation, and I showe</w:t>
+      </w:r>
+      <w:r>
+        <w:t>d everyone how I would demonstrate both tools. We discussed the options for reducing/expanding the size of the presentation in post.</w:t>
+      </w:r>
+      <w:r>
+        <w:t xml:space="preserve"> We also noticed that the due date of the progress presentation differs in the upload point to its description.</w:t>
       </w:r>
     </w:p>
     <w:p>
@@ -2561,7 +2661,7 @@
           <w:rStyle w:val="Heading2Char"/>
         </w:rPr>
       </w:pPr>
-      <w:bookmarkStart w:id="3" w:name="_Toc240221604"/>
+      <w:bookmarkStart w:id="3" w:name="_Toc240451465"/>
       <w:r>
         <w:rPr>
           <w:rStyle w:val="Heading2Char"/>
@@ -2571,11 +2671,40 @@
       <w:bookmarkEnd w:id="3"/>
     </w:p>
     <w:p>
-      <w:r>
-        <w:t xml:space="preserve">Monday, </w:t>
-      </w:r>
-      <w:r>
-        <w:t>September 14</w:t>
+      <w:bookmarkStart w:id="4" w:name="_Toc240451466"/>
+      <w:r>
+        <w:t>Monday, September 14th</w:t>
+      </w:r>
+      <w:bookmarkEnd w:id="4"/>
+    </w:p>
+    <w:p>
+      <w:r>
+        <w:t>8-10PM (2hrs)</w:t>
+      </w:r>
+    </w:p>
+    <w:p>
+      <w:r>
+        <w:t>Bryce went over our presentation, gave us some advice for each section, we discussed the inclusion of recent developments of nMap script, when and how he might demonstrate/share his existing solution of an AI-augmented nMap analysis script. He demonstrated his network tunnelling through ssh and remote viewer that in future may allow us to access resources on his network.</w:t>
+      </w:r>
+    </w:p>
+    <w:p>
+      <w:r>
+        <w:t>11-12PM (1hr)</w:t>
+      </w:r>
+    </w:p>
+    <w:p>
+      <w:r>
+        <w:t>We spoke to clement about upcoming presentation, progress on the project and confidence, discussed options for dealing with the issue of Sam and Dave’s missed weekly logs. We discussed how to document the project management portion of the project.</w:t>
+      </w:r>
+    </w:p>
+    <w:p>
+      <w:pPr>
+        <w:rPr>
+          <w:vertAlign w:val="superscript"/>
+        </w:rPr>
+      </w:pPr>
+      <w:r>
+        <w:t>Friday, September 18</w:t>
       </w:r>
       <w:r>
         <w:rPr>
@@ -2586,7 +2715,105 @@
     </w:p>
     <w:p>
       <w:r>
-        <w:t>8-10PM (2hrs)</w:t>
+        <w:t xml:space="preserve">9:00 – </w:t>
+      </w:r>
+      <w:r>
+        <w:t>11:</w:t>
+      </w:r>
+      <w:r>
+        <w:t>15</w:t>
+      </w:r>
+      <w:r>
+        <w:t>AM</w:t>
+      </w:r>
+      <w:r>
+        <w:t xml:space="preserve"> (</w:t>
+      </w:r>
+      <w:r>
+        <w:t>2</w:t>
+      </w:r>
+      <w:r>
+        <w:t xml:space="preserve"> </w:t>
+      </w:r>
+      <w:r>
+        <w:t>hours</w:t>
+      </w:r>
+      <w:r>
+        <w:t xml:space="preserve"> 15 min</w:t>
+      </w:r>
+      <w:r>
+        <w:t>)</w:t>
+      </w:r>
+    </w:p>
+    <w:p>
+      <w:r>
+        <w:t xml:space="preserve">Meeting with </w:t>
+      </w:r>
+      <w:r>
+        <w:t>Bryce</w:t>
+      </w:r>
+      <w:r>
+        <w:t>, all present, discussing the self management review, other upcoming academic documents.</w:t>
+      </w:r>
+      <w:r>
+        <w:t xml:space="preserve"> We talked about black swan events, Stuxnet, 9/11, panamax containers, suez crisis</w:t>
+      </w:r>
+      <w:r>
+        <w:t xml:space="preserve"> (2021)</w:t>
+      </w:r>
+      <w:r>
+        <w:t xml:space="preserve">. We discussed solutions to logbook </w:t>
+      </w:r>
+      <w:r>
+        <w:t>issue. 5R</w:t>
+      </w:r>
+      <w:r>
+        <w:t>/STARR</w:t>
+      </w:r>
+      <w:r>
+        <w:t>/5w1h</w:t>
+      </w:r>
+      <w:r>
+        <w:t xml:space="preserve"> reflection framework</w:t>
+      </w:r>
+      <w:r>
+        <w:t>s</w:t>
+      </w:r>
+      <w:r>
+        <w:t>.</w:t>
+      </w:r>
+      <w:r>
+        <w:t xml:space="preserve"> Talking about permissions and usage of </w:t>
+      </w:r>
+      <w:r>
+        <w:t>W</w:t>
+      </w:r>
+      <w:r>
+        <w:t>ireshark and nmap</w:t>
+      </w:r>
+      <w:r>
+        <w:t xml:space="preserve">. Also talked to him without dave present about </w:t>
+      </w:r>
+      <w:r>
+        <w:t xml:space="preserve">how to </w:t>
+      </w:r>
+      <w:r>
+        <w:t>produc</w:t>
+      </w:r>
+      <w:r>
+        <w:t>e</w:t>
+      </w:r>
+      <w:r>
+        <w:t xml:space="preserve"> a pre – engagement </w:t>
+      </w:r>
+      <w:r>
+        <w:t>report</w:t>
+      </w:r>
+      <w:r>
+        <w:t xml:space="preserve"> which is relevant to the project because we are asking for permission from Geoff to scan the network with nMap</w:t>
+      </w:r>
+      <w:r>
+        <w:t>.</w:t>
       </w:r>
     </w:p>
     <w:p>
@@ -2597,114 +2824,1457 @@
           <w:sz w:val="22"/>
         </w:rPr>
       </w:pPr>
+    </w:p>
+    <w:p>
+      <w:pPr>
+        <w:pStyle w:val="Heading2"/>
+      </w:pPr>
+      <w:bookmarkStart w:id="5" w:name="_Toc240451467"/>
+      <w:r>
+        <w:t>Client Meetings</w:t>
+      </w:r>
+      <w:bookmarkEnd w:id="5"/>
+    </w:p>
+    <w:p>
+      <w:r>
+        <w:t>Tuesday</w:t>
+      </w:r>
+      <w:r>
+        <w:t xml:space="preserve">, </w:t>
+      </w:r>
+      <w:r>
+        <w:t>September 15</w:t>
+      </w:r>
       <w:r>
         <w:rPr>
-          <w:rStyle w:val="Heading2Char"/>
-          <w:color w:val="000000"/>
-          <w:sz w:val="22"/>
+          <w:vertAlign w:val="superscript"/>
         </w:rPr>
-        <w:t>Bryce went over our presentation, gave us some advice for each section, we discussed the inclusion of recent developments of nMap script, when and how he might demonstrate/share his existing solution of an AI-augmented nMap analysis script.</w:t>
-      </w:r>
+        <w:t>th</w:t>
+      </w:r>
+    </w:p>
+    <w:p>
+      <w:r>
+        <w:t xml:space="preserve">2:30 – </w:t>
+      </w:r>
+      <w:r>
+        <w:t>3:</w:t>
+      </w:r>
+      <w:r>
+        <w:t>45PM (1hr 15)</w:t>
+      </w:r>
+    </w:p>
+    <w:p>
+      <w:r>
+        <w:t>Actually meeting with Geoff, giving presentation. D</w:t>
+      </w:r>
+      <w:r>
+        <w:t>iscussion after about the progress of the project, permission to do nmap</w:t>
+      </w:r>
+      <w:r>
+        <w:t>/wireshark</w:t>
+      </w:r>
+      <w:r>
+        <w:t xml:space="preserve"> scanning</w:t>
+      </w:r>
+      <w:r>
+        <w:t xml:space="preserve"> on school network</w:t>
+      </w:r>
+      <w:r>
+        <w:t xml:space="preserve">. </w:t>
+      </w:r>
+      <w:r>
+        <w:t>D</w:t>
+      </w:r>
+      <w:r>
+        <w:t>iscussion</w:t>
+      </w:r>
+      <w:r>
+        <w:t xml:space="preserve"> about limitations of AI</w:t>
+      </w:r>
+      <w:r>
+        <w:t>.</w:t>
+      </w:r>
+      <w:r>
+        <w:t xml:space="preserve"> </w:t>
+      </w:r>
+    </w:p>
+    <w:p/>
+    <w:p>
+      <w:pPr>
+        <w:pStyle w:val="Heading2"/>
+      </w:pPr>
+      <w:bookmarkStart w:id="6" w:name="_Toc240451468"/>
+      <w:r>
+        <w:lastRenderedPageBreak/>
+        <w:t>Research</w:t>
+      </w:r>
+      <w:bookmarkEnd w:id="6"/>
+    </w:p>
+    <w:p/>
+    <w:p>
+      <w:pPr>
+        <w:pStyle w:val="Heading2"/>
+      </w:pPr>
+      <w:bookmarkStart w:id="7" w:name="_Toc240451469"/>
+      <w:r>
+        <w:t>Documentation</w:t>
+      </w:r>
+      <w:bookmarkEnd w:id="7"/>
+    </w:p>
+    <w:p>
+      <w:r>
+        <w:t>Tuesday, September 15</w:t>
+      </w:r>
+    </w:p>
+    <w:p>
+      <w:r>
+        <w:t xml:space="preserve">5:00 – </w:t>
+      </w:r>
+      <w:r>
+        <w:t>7:15</w:t>
+      </w:r>
+      <w:r>
+        <w:t xml:space="preserve"> (</w:t>
+      </w:r>
+      <w:r>
+        <w:t>2hrs 15 min</w:t>
+      </w:r>
+      <w:r>
+        <w:t>)</w:t>
+      </w:r>
+    </w:p>
+    <w:p>
+      <w:r>
+        <w:t>Editing</w:t>
+      </w:r>
+      <w:r>
+        <w:t>,</w:t>
+      </w:r>
+      <w:r>
+        <w:t xml:space="preserve"> rendering</w:t>
+      </w:r>
+      <w:r>
+        <w:t>, and encoding</w:t>
+      </w:r>
+      <w:r>
+        <w:t xml:space="preserve"> </w:t>
+      </w:r>
+      <w:r>
+        <w:t>the video of the presentation</w:t>
+      </w:r>
+      <w:r>
+        <w:t xml:space="preserve"> we presented to Geoff.</w:t>
+      </w:r>
+      <w:r>
+        <w:t xml:space="preserve"> Geoff asked a lot of questions and the answering + discussion was extensive, so I included the best sec</w:t>
+      </w:r>
+      <w:r>
+        <w:t>tions/questions. Mixing the audio (my audio was originally much higher than everyone else) was a necessary fix.</w:t>
+      </w:r>
+      <w:r>
+        <w:t xml:space="preserve"> </w:t>
+      </w:r>
+      <w:r>
+        <w:t>I also then had to watch the video (all 15 mins) back to make sure it all sounded right.</w:t>
+      </w:r>
+    </w:p>
+    <w:p>
+      <w:pPr>
+        <w:pStyle w:val="Heading2"/>
+      </w:pPr>
+      <w:bookmarkStart w:id="8" w:name="_Toc240451470"/>
+      <w:r>
+        <w:t>Testing</w:t>
+      </w:r>
+      <w:bookmarkEnd w:id="8"/>
+    </w:p>
+    <w:p>
+      <w:r>
+        <w:t>Wednesday, September 16</w:t>
+      </w:r>
+    </w:p>
+    <w:p>
+      <w:r>
+        <w:t>12:00</w:t>
+      </w:r>
+      <w:r>
+        <w:t xml:space="preserve"> – 2:15PM (2hrs 15 min)</w:t>
+      </w:r>
+    </w:p>
+    <w:p>
+      <w:r>
+        <w:t>Based on Geoff’s question</w:t>
+      </w:r>
+      <w:r>
+        <w:t>, I seek to figure out if its possible to calculate the token cost with my Foremost script.</w:t>
+      </w:r>
+      <w:r>
+        <w:t xml:space="preserve"> I also want to experiment with JSON formats.</w:t>
+      </w:r>
+    </w:p>
+    <w:p>
+      <w:r>
+        <w:t>Using –verbose flag shows token count and other metrics, but these statistics appear in the observer’s cli directly, I want to be able to add these up into a total token count of the ran script.</w:t>
+      </w:r>
+    </w:p>
+    <w:p>
       <w:r>
         <w:rPr>
-          <w:rStyle w:val="Heading2Char"/>
-          <w:color w:val="000000"/>
-          <w:sz w:val="22"/>
+          <w:noProof/>
         </w:rPr>
-        <w:t xml:space="preserve"> He demonstrated his network tunnelling through ssh and remote viewer that in future may allow us to access resources on his network.</w:t>
-      </w:r>
-    </w:p>
-    <w:p>
-      <w:pPr>
+        <w:drawing>
+          <wp:inline distT="0" distB="0" distL="0" distR="0" wp14:anchorId="4C0FFEFB" wp14:editId="57C606B6">
+            <wp:extent cx="3286125" cy="2136307"/>
+            <wp:effectExtent l="0" t="0" r="0" b="0"/>
+            <wp:docPr id="2055440559" name="Picture 1"/>
+            <wp:cNvGraphicFramePr>
+              <a:graphicFrameLocks xmlns:a="http://schemas.openxmlformats.org/drawingml/2006/main" noChangeAspect="1"/>
+            </wp:cNvGraphicFramePr>
+            <a:graphic xmlns:a="http://schemas.openxmlformats.org/drawingml/2006/main">
+              <a:graphicData uri="http://schemas.openxmlformats.org/drawingml/2006/picture">
+                <pic:pic xmlns:pic="http://schemas.openxmlformats.org/drawingml/2006/picture">
+                  <pic:nvPicPr>
+                    <pic:cNvPr id="2055440559" name=""/>
+                    <pic:cNvPicPr/>
+                  </pic:nvPicPr>
+                  <pic:blipFill>
+                    <a:blip r:embed="rId9"/>
+                    <a:stretch>
+                      <a:fillRect/>
+                    </a:stretch>
+                  </pic:blipFill>
+                  <pic:spPr>
+                    <a:xfrm>
+                      <a:off x="0" y="0"/>
+                      <a:ext cx="3289400" cy="2138436"/>
+                    </a:xfrm>
+                    <a:prstGeom prst="rect">
+                      <a:avLst/>
+                    </a:prstGeom>
+                  </pic:spPr>
+                </pic:pic>
+              </a:graphicData>
+            </a:graphic>
+          </wp:inline>
+        </w:drawing>
+      </w:r>
+    </w:p>
+    <w:p>
+      <w:r>
+        <w:t>IT appears that possibly the best way to do this might to be to use capture_output subprocess feature, which hopefully works while also generating the scan chunks.</w:t>
+      </w:r>
+    </w:p>
+    <w:p>
+      <w:r>
+        <w:t xml:space="preserve">Setting the output of the first </w:t>
+      </w:r>
+      <w:r>
+        <w:t xml:space="preserve">chunking </w:t>
+      </w:r>
+      <w:r>
+        <w:t>command to a</w:t>
+      </w:r>
+      <w:r>
+        <w:t xml:space="preserve"> variable (1) with output captured directly (2) and printed out immediately after to test (3) </w:t>
+      </w:r>
+    </w:p>
+    <w:p>
+      <w:r>
         <w:rPr>
-          <w:rStyle w:val="Heading2Char"/>
-          <w:color w:val="000000"/>
-          <w:sz w:val="22"/>
+          <w:noProof/>
         </w:rPr>
-      </w:pPr>
+        <w:drawing>
+          <wp:inline distT="0" distB="0" distL="0" distR="0" wp14:anchorId="42D61827" wp14:editId="3C00C021">
+            <wp:extent cx="5978718" cy="1219200"/>
+            <wp:effectExtent l="0" t="0" r="3175" b="0"/>
+            <wp:docPr id="1506403868" name="Picture 1"/>
+            <wp:cNvGraphicFramePr>
+              <a:graphicFrameLocks xmlns:a="http://schemas.openxmlformats.org/drawingml/2006/main" noChangeAspect="1"/>
+            </wp:cNvGraphicFramePr>
+            <a:graphic xmlns:a="http://schemas.openxmlformats.org/drawingml/2006/main">
+              <a:graphicData uri="http://schemas.openxmlformats.org/drawingml/2006/picture">
+                <pic:pic xmlns:pic="http://schemas.openxmlformats.org/drawingml/2006/picture">
+                  <pic:nvPicPr>
+                    <pic:cNvPr id="1506403868" name=""/>
+                    <pic:cNvPicPr/>
+                  </pic:nvPicPr>
+                  <pic:blipFill>
+                    <a:blip r:embed="rId10"/>
+                    <a:stretch>
+                      <a:fillRect/>
+                    </a:stretch>
+                  </pic:blipFill>
+                  <pic:spPr>
+                    <a:xfrm>
+                      <a:off x="0" y="0"/>
+                      <a:ext cx="5979323" cy="1219323"/>
+                    </a:xfrm>
+                    <a:prstGeom prst="rect">
+                      <a:avLst/>
+                    </a:prstGeom>
+                  </pic:spPr>
+                </pic:pic>
+              </a:graphicData>
+            </a:graphic>
+          </wp:inline>
+        </w:drawing>
+      </w:r>
+    </w:p>
+    <w:p>
+      <w:r>
+        <w:lastRenderedPageBreak/>
+        <w:t>The stats are included in the variable, but python/subprocess doesn’t like 3 different types of output.</w:t>
+      </w:r>
+    </w:p>
+    <w:p>
       <w:r>
         <w:rPr>
-          <w:rStyle w:val="Heading2Char"/>
-          <w:color w:val="000000"/>
-          <w:sz w:val="22"/>
+          <w:noProof/>
         </w:rPr>
-        <w:t>11-12PM (1hr)</w:t>
-      </w:r>
-    </w:p>
-    <w:p>
-      <w:pPr>
+        <w:drawing>
+          <wp:inline distT="0" distB="0" distL="0" distR="0" wp14:anchorId="636CA6A1" wp14:editId="4853E3F4">
+            <wp:extent cx="5729605" cy="1108710"/>
+            <wp:effectExtent l="0" t="0" r="4445" b="0"/>
+            <wp:docPr id="1430963841" name="Picture 1"/>
+            <wp:cNvGraphicFramePr>
+              <a:graphicFrameLocks xmlns:a="http://schemas.openxmlformats.org/drawingml/2006/main" noChangeAspect="1"/>
+            </wp:cNvGraphicFramePr>
+            <a:graphic xmlns:a="http://schemas.openxmlformats.org/drawingml/2006/main">
+              <a:graphicData uri="http://schemas.openxmlformats.org/drawingml/2006/picture">
+                <pic:pic xmlns:pic="http://schemas.openxmlformats.org/drawingml/2006/picture">
+                  <pic:nvPicPr>
+                    <pic:cNvPr id="1430963841" name=""/>
+                    <pic:cNvPicPr/>
+                  </pic:nvPicPr>
+                  <pic:blipFill>
+                    <a:blip r:embed="rId11"/>
+                    <a:stretch>
+                      <a:fillRect/>
+                    </a:stretch>
+                  </pic:blipFill>
+                  <pic:spPr>
+                    <a:xfrm>
+                      <a:off x="0" y="0"/>
+                      <a:ext cx="5729605" cy="1108710"/>
+                    </a:xfrm>
+                    <a:prstGeom prst="rect">
+                      <a:avLst/>
+                    </a:prstGeom>
+                  </pic:spPr>
+                </pic:pic>
+              </a:graphicData>
+            </a:graphic>
+          </wp:inline>
+        </w:drawing>
+      </w:r>
+    </w:p>
+    <w:p/>
+    <w:p/>
+    <w:p/>
+    <w:p>
+      <w:r>
+        <w:t>Instead of displaying as a variable, displaying as stderr, only displays what was captured by “capture_output”, which only includes the –verbose information. I also tested with stdout, because both are captured by “capture_output”, but that line did not print anything.</w:t>
+      </w:r>
+    </w:p>
+    <w:p>
+      <w:r>
         <w:rPr>
-          <w:rStyle w:val="Heading2Char"/>
-          <w:color w:val="000000"/>
-          <w:sz w:val="22"/>
+          <w:noProof/>
         </w:rPr>
-      </w:pPr>
+        <w:drawing>
+          <wp:inline distT="0" distB="0" distL="0" distR="0" wp14:anchorId="443F5398" wp14:editId="3A10E64E">
+            <wp:extent cx="4532243" cy="803176"/>
+            <wp:effectExtent l="0" t="0" r="1905" b="0"/>
+            <wp:docPr id="1203917145" name="Picture 1"/>
+            <wp:cNvGraphicFramePr>
+              <a:graphicFrameLocks xmlns:a="http://schemas.openxmlformats.org/drawingml/2006/main" noChangeAspect="1"/>
+            </wp:cNvGraphicFramePr>
+            <a:graphic xmlns:a="http://schemas.openxmlformats.org/drawingml/2006/main">
+              <a:graphicData uri="http://schemas.openxmlformats.org/drawingml/2006/picture">
+                <pic:pic xmlns:pic="http://schemas.openxmlformats.org/drawingml/2006/picture">
+                  <pic:nvPicPr>
+                    <pic:cNvPr id="1203917145" name=""/>
+                    <pic:cNvPicPr/>
+                  </pic:nvPicPr>
+                  <pic:blipFill>
+                    <a:blip r:embed="rId12"/>
+                    <a:stretch>
+                      <a:fillRect/>
+                    </a:stretch>
+                  </pic:blipFill>
+                  <pic:spPr>
+                    <a:xfrm>
+                      <a:off x="0" y="0"/>
+                      <a:ext cx="4541769" cy="804864"/>
+                    </a:xfrm>
+                    <a:prstGeom prst="rect">
+                      <a:avLst/>
+                    </a:prstGeom>
+                  </pic:spPr>
+                </pic:pic>
+              </a:graphicData>
+            </a:graphic>
+          </wp:inline>
+        </w:drawing>
+      </w:r>
+    </w:p>
+    <w:p>
+      <w:r>
+        <w:t>Only information I can find is that in container env, ollama outputs logs to stderr, which must include diagnostic info such as token counts.</w:t>
+      </w:r>
+    </w:p>
+    <w:p>
       <w:r>
         <w:rPr>
-          <w:rStyle w:val="Heading2Char"/>
-          <w:color w:val="000000"/>
-          <w:sz w:val="22"/>
+          <w:noProof/>
         </w:rPr>
-        <w:t>We spoke to clement about upcoming presentation, progress on the project and confidence, discussed options for dealing with the issue of Sam and Dave’s missed weekly logs. We discussed how to document the project management portion of the project.</w:t>
-      </w:r>
+        <w:drawing>
+          <wp:inline distT="0" distB="0" distL="0" distR="0" wp14:anchorId="00B0CD1D" wp14:editId="663E3020">
+            <wp:extent cx="4675517" cy="1279899"/>
+            <wp:effectExtent l="0" t="0" r="0" b="0"/>
+            <wp:docPr id="1454140678" name="Picture 1"/>
+            <wp:cNvGraphicFramePr>
+              <a:graphicFrameLocks xmlns:a="http://schemas.openxmlformats.org/drawingml/2006/main" noChangeAspect="1"/>
+            </wp:cNvGraphicFramePr>
+            <a:graphic xmlns:a="http://schemas.openxmlformats.org/drawingml/2006/main">
+              <a:graphicData uri="http://schemas.openxmlformats.org/drawingml/2006/picture">
+                <pic:pic xmlns:pic="http://schemas.openxmlformats.org/drawingml/2006/picture">
+                  <pic:nvPicPr>
+                    <pic:cNvPr id="1454140678" name=""/>
+                    <pic:cNvPicPr/>
+                  </pic:nvPicPr>
+                  <pic:blipFill>
+                    <a:blip r:embed="rId13"/>
+                    <a:stretch>
+                      <a:fillRect/>
+                    </a:stretch>
+                  </pic:blipFill>
+                  <pic:spPr>
+                    <a:xfrm>
+                      <a:off x="0" y="0"/>
+                      <a:ext cx="4680914" cy="1281376"/>
+                    </a:xfrm>
+                    <a:prstGeom prst="rect">
+                      <a:avLst/>
+                    </a:prstGeom>
+                  </pic:spPr>
+                </pic:pic>
+              </a:graphicData>
+            </a:graphic>
+          </wp:inline>
+        </w:drawing>
+      </w:r>
+    </w:p>
+    <w:p>
+      <w:r>
+        <w:t>Now all I need to do it save them as an input and add them up. Because the –verbose flag contains lots of data, it will be hard to collect only the token info, I could append this text to the chunkSum.txt and have the AI calculate it, or I could collect the “prompt eval count”(input) and “eval count”(output) individually somehow.</w:t>
+      </w:r>
+    </w:p>
+    <w:p/>
+    <w:p/>
+    <w:p/>
+    <w:p/>
+    <w:p/>
+    <w:p/>
+    <w:p/>
+    <w:p>
+      <w:r>
+        <w:lastRenderedPageBreak/>
+        <w:t>Saturday, September 19</w:t>
+      </w:r>
+    </w:p>
+    <w:p>
+      <w:r>
+        <w:t>2:45PM</w:t>
+      </w:r>
+      <w:r>
+        <w:t xml:space="preserve"> – 3:30PM (45 mins)</w:t>
+      </w:r>
+    </w:p>
+    <w:p>
+      <w:r>
+        <w:t>Installing and testing an xml-JSON format conversion tool. Requires a venv. It took awhile to realise I needed to use the venv created in the same folder as the pcaps</w:t>
+      </w:r>
+      <w:r>
+        <w:t xml:space="preserve"> and install nmap2json there.</w:t>
+      </w:r>
+    </w:p>
+    <w:p>
+      <w:r>
+        <w:drawing>
+          <wp:inline distT="0" distB="0" distL="0" distR="0" wp14:anchorId="43D5A56E" wp14:editId="2FDEC365">
+            <wp:extent cx="4102873" cy="2721910"/>
+            <wp:effectExtent l="0" t="0" r="0" b="2540"/>
+            <wp:docPr id="320507436" name="Picture 1"/>
+            <wp:cNvGraphicFramePr>
+              <a:graphicFrameLocks xmlns:a="http://schemas.openxmlformats.org/drawingml/2006/main" noChangeAspect="1"/>
+            </wp:cNvGraphicFramePr>
+            <a:graphic xmlns:a="http://schemas.openxmlformats.org/drawingml/2006/main">
+              <a:graphicData uri="http://schemas.openxmlformats.org/drawingml/2006/picture">
+                <pic:pic xmlns:pic="http://schemas.openxmlformats.org/drawingml/2006/picture">
+                  <pic:nvPicPr>
+                    <pic:cNvPr id="320507436" name=""/>
+                    <pic:cNvPicPr/>
+                  </pic:nvPicPr>
+                  <pic:blipFill>
+                    <a:blip r:embed="rId14"/>
+                    <a:stretch>
+                      <a:fillRect/>
+                    </a:stretch>
+                  </pic:blipFill>
+                  <pic:spPr>
+                    <a:xfrm>
+                      <a:off x="0" y="0"/>
+                      <a:ext cx="4108710" cy="2725782"/>
+                    </a:xfrm>
+                    <a:prstGeom prst="rect">
+                      <a:avLst/>
+                    </a:prstGeom>
+                  </pic:spPr>
+                </pic:pic>
+              </a:graphicData>
+            </a:graphic>
+          </wp:inline>
+        </w:drawing>
+      </w:r>
+    </w:p>
+    <w:p>
+      <w:r>
+        <w:t>The json conversion worked, each host and its relevant ports and services is structured in a JSON list/array format.</w:t>
+      </w:r>
+    </w:p>
+    <w:p>
+      <w:r>
+        <w:drawing>
+          <wp:inline distT="0" distB="0" distL="0" distR="0" wp14:anchorId="67E429C8" wp14:editId="1142B93E">
+            <wp:extent cx="5729605" cy="3260725"/>
+            <wp:effectExtent l="0" t="0" r="4445" b="0"/>
+            <wp:docPr id="10563803" name="Picture 1"/>
+            <wp:cNvGraphicFramePr>
+              <a:graphicFrameLocks xmlns:a="http://schemas.openxmlformats.org/drawingml/2006/main" noChangeAspect="1"/>
+            </wp:cNvGraphicFramePr>
+            <a:graphic xmlns:a="http://schemas.openxmlformats.org/drawingml/2006/main">
+              <a:graphicData uri="http://schemas.openxmlformats.org/drawingml/2006/picture">
+                <pic:pic xmlns:pic="http://schemas.openxmlformats.org/drawingml/2006/picture">
+                  <pic:nvPicPr>
+                    <pic:cNvPr id="10563803" name=""/>
+                    <pic:cNvPicPr/>
+                  </pic:nvPicPr>
+                  <pic:blipFill>
+                    <a:blip r:embed="rId15"/>
+                    <a:stretch>
+                      <a:fillRect/>
+                    </a:stretch>
+                  </pic:blipFill>
+                  <pic:spPr>
+                    <a:xfrm>
+                      <a:off x="0" y="0"/>
+                      <a:ext cx="5729605" cy="3260725"/>
+                    </a:xfrm>
+                    <a:prstGeom prst="rect">
+                      <a:avLst/>
+                    </a:prstGeom>
+                  </pic:spPr>
+                </pic:pic>
+              </a:graphicData>
+            </a:graphic>
+          </wp:inline>
+        </w:drawing>
+      </w:r>
+    </w:p>
+    <w:p/>
+    <w:p/>
+    <w:p/>
+    <w:p>
+      <w:pPr>
+        <w:ind w:left="0" w:firstLine="0"/>
+      </w:pPr>
     </w:p>
     <w:p>
       <w:pPr>
         <w:pStyle w:val="Heading2"/>
       </w:pPr>
-      <w:bookmarkStart w:id="4" w:name="_Toc240221605"/>
-      <w:r>
-        <w:t>Client Meetings</w:t>
-      </w:r>
-      <w:bookmarkEnd w:id="4"/>
-    </w:p>
-    <w:p>
-      <w:pPr>
-        <w:pStyle w:val="Heading2"/>
-      </w:pPr>
-      <w:bookmarkStart w:id="5" w:name="_Toc240221606"/>
-      <w:r>
-        <w:t>Research</w:t>
-      </w:r>
-      <w:bookmarkEnd w:id="5"/>
-    </w:p>
-    <w:p>
-      <w:pPr>
-        <w:pStyle w:val="Heading2"/>
-      </w:pPr>
-      <w:bookmarkStart w:id="6" w:name="_Toc240221607"/>
-      <w:r>
-        <w:t>Documentation</w:t>
-      </w:r>
-      <w:bookmarkEnd w:id="6"/>
+      <w:bookmarkStart w:id="9" w:name="_Toc240451471"/>
+      <w:r>
+        <w:lastRenderedPageBreak/>
+        <w:t>Development</w:t>
+      </w:r>
+      <w:bookmarkEnd w:id="9"/>
+    </w:p>
+    <w:p>
+      <w:r>
+        <w:t>Friday, September 19</w:t>
+      </w:r>
+    </w:p>
+    <w:p>
+      <w:r>
+        <w:t xml:space="preserve">4:00PM </w:t>
+      </w:r>
+      <w:r>
+        <w:t>–</w:t>
+      </w:r>
+      <w:r>
+        <w:t xml:space="preserve"> </w:t>
+      </w:r>
+      <w:r>
+        <w:t>9</w:t>
+      </w:r>
+      <w:r>
+        <w:t>:</w:t>
+      </w:r>
+      <w:r>
+        <w:t>15</w:t>
+      </w:r>
+      <w:r>
+        <w:t>PM (</w:t>
+      </w:r>
+      <w:r>
+        <w:t>5</w:t>
+      </w:r>
+      <w:r>
+        <w:t>hrs</w:t>
+      </w:r>
+      <w:r>
+        <w:t xml:space="preserve"> 15 min</w:t>
+      </w:r>
+      <w:r>
+        <w:t>)</w:t>
+      </w:r>
+    </w:p>
+    <w:p>
+      <w:r>
+        <w:t>Development on SilentCartographerV1, adding up the input and output token counts for each promp</w:t>
+      </w:r>
+      <w:r>
+        <w:t>t. The –verbose output from ollama is in string format so I had to figure out how to convert just the parts I want (eval and prompt_eval) token counts and add them together using “re”</w:t>
+      </w:r>
+      <w:r>
+        <w:t xml:space="preserve"> for regular expression modules</w:t>
+      </w:r>
+      <w:r>
+        <w:t>.</w:t>
+      </w:r>
+      <w:r>
+        <w:t xml:space="preserve"> </w:t>
+      </w:r>
+    </w:p>
+    <w:p>
+      <w:hyperlink r:id="rId16" w:history="1">
+        <w:r>
+          <w:rPr>
+            <w:rStyle w:val="Hyperlink"/>
+          </w:rPr>
+          <w:t>https://stackoverflow.com/questions/4703390/how-to-extract-a-floating-number-from-a-string</w:t>
+        </w:r>
+      </w:hyperlink>
     </w:p>
     <w:p/>
     <w:p>
-      <w:pPr>
-        <w:pStyle w:val="Heading2"/>
-      </w:pPr>
-      <w:bookmarkStart w:id="7" w:name="_Toc240221608"/>
-      <w:r>
-        <w:t>Testing</w:t>
-      </w:r>
-      <w:bookmarkEnd w:id="7"/>
+      <w:r>
+        <w:t>new function couldn’t access chunkStats variables from the main function.</w:t>
+      </w:r>
+    </w:p>
+    <w:p>
+      <w:r>
+        <w:drawing>
+          <wp:inline distT="0" distB="0" distL="0" distR="0" wp14:anchorId="377E8F2A" wp14:editId="36D7BB0F">
+            <wp:extent cx="5152445" cy="632706"/>
+            <wp:effectExtent l="0" t="0" r="0" b="0"/>
+            <wp:docPr id="1671015040" name="Picture 1"/>
+            <wp:cNvGraphicFramePr>
+              <a:graphicFrameLocks xmlns:a="http://schemas.openxmlformats.org/drawingml/2006/main" noChangeAspect="1"/>
+            </wp:cNvGraphicFramePr>
+            <a:graphic xmlns:a="http://schemas.openxmlformats.org/drawingml/2006/main">
+              <a:graphicData uri="http://schemas.openxmlformats.org/drawingml/2006/picture">
+                <pic:pic xmlns:pic="http://schemas.openxmlformats.org/drawingml/2006/picture">
+                  <pic:nvPicPr>
+                    <pic:cNvPr id="1671015040" name=""/>
+                    <pic:cNvPicPr/>
+                  </pic:nvPicPr>
+                  <pic:blipFill>
+                    <a:blip r:embed="rId17"/>
+                    <a:stretch>
+                      <a:fillRect/>
+                    </a:stretch>
+                  </pic:blipFill>
+                  <pic:spPr>
+                    <a:xfrm>
+                      <a:off x="0" y="0"/>
+                      <a:ext cx="5170384" cy="634909"/>
+                    </a:xfrm>
+                    <a:prstGeom prst="rect">
+                      <a:avLst/>
+                    </a:prstGeom>
+                  </pic:spPr>
+                </pic:pic>
+              </a:graphicData>
+            </a:graphic>
+          </wp:inline>
+        </w:drawing>
+      </w:r>
+    </w:p>
+    <w:p>
+      <w:r>
+        <w:t>I fixed by returning them from the main function and passing them in as variables to the calctokens function. This makes the code unnecessarily comp</w:t>
+      </w:r>
+      <w:r>
+        <w:t>licated and although I wanted more than 1 function the calculation of total tokens might as well be in the same function they are collected from.</w:t>
+      </w:r>
+    </w:p>
+    <w:p>
+      <w:r>
+        <w:t>This was the code that used the secondary function, with changes highlighted</w:t>
+      </w:r>
+    </w:p>
+    <w:p>
+      <w:r>
+        <w:drawing>
+          <wp:inline distT="0" distB="0" distL="0" distR="0" wp14:anchorId="0C129B12" wp14:editId="3CD0D910">
+            <wp:extent cx="4778734" cy="3562733"/>
+            <wp:effectExtent l="0" t="0" r="3175" b="0"/>
+            <wp:docPr id="1156157891" name="Picture 1"/>
+            <wp:cNvGraphicFramePr>
+              <a:graphicFrameLocks xmlns:a="http://schemas.openxmlformats.org/drawingml/2006/main" noChangeAspect="1"/>
+            </wp:cNvGraphicFramePr>
+            <a:graphic xmlns:a="http://schemas.openxmlformats.org/drawingml/2006/main">
+              <a:graphicData uri="http://schemas.openxmlformats.org/drawingml/2006/picture">
+                <pic:pic xmlns:pic="http://schemas.openxmlformats.org/drawingml/2006/picture">
+                  <pic:nvPicPr>
+                    <pic:cNvPr id="1156157891" name=""/>
+                    <pic:cNvPicPr/>
+                  </pic:nvPicPr>
+                  <pic:blipFill>
+                    <a:blip r:embed="rId18"/>
+                    <a:stretch>
+                      <a:fillRect/>
+                    </a:stretch>
+                  </pic:blipFill>
+                  <pic:spPr>
+                    <a:xfrm>
+                      <a:off x="0" y="0"/>
+                      <a:ext cx="4780497" cy="3564047"/>
+                    </a:xfrm>
+                    <a:prstGeom prst="rect">
+                      <a:avLst/>
+                    </a:prstGeom>
+                  </pic:spPr>
+                </pic:pic>
+              </a:graphicData>
+            </a:graphic>
+          </wp:inline>
+        </w:drawing>
+      </w:r>
     </w:p>
     <w:p/>
-    <w:p>
-      <w:pPr>
-        <w:pStyle w:val="Heading2"/>
-      </w:pPr>
-      <w:bookmarkStart w:id="8" w:name="_Toc240221609"/>
-      <w:r>
-        <w:t>Development</w:t>
-      </w:r>
-      <w:bookmarkEnd w:id="8"/>
+    <w:p/>
+    <w:p>
+      <w:r>
+        <w:lastRenderedPageBreak/>
+        <w:t>Also got this error, due to my command using “findall” which looks for the target data in lists I believe?</w:t>
+      </w:r>
+      <w:r>
+        <w:t xml:space="preserve"> I also realise at this point that token counts are actually round numbers (int), it’s the rates that are floats.</w:t>
+      </w:r>
+    </w:p>
+    <w:p>
+      <w:r>
+        <w:drawing>
+          <wp:inline distT="0" distB="0" distL="0" distR="0" wp14:anchorId="56F122FA" wp14:editId="023FD66C">
+            <wp:extent cx="5729605" cy="617855"/>
+            <wp:effectExtent l="0" t="0" r="4445" b="0"/>
+            <wp:docPr id="1723422929" name="Picture 1"/>
+            <wp:cNvGraphicFramePr>
+              <a:graphicFrameLocks xmlns:a="http://schemas.openxmlformats.org/drawingml/2006/main" noChangeAspect="1"/>
+            </wp:cNvGraphicFramePr>
+            <a:graphic xmlns:a="http://schemas.openxmlformats.org/drawingml/2006/main">
+              <a:graphicData uri="http://schemas.openxmlformats.org/drawingml/2006/picture">
+                <pic:pic xmlns:pic="http://schemas.openxmlformats.org/drawingml/2006/picture">
+                  <pic:nvPicPr>
+                    <pic:cNvPr id="1723422929" name=""/>
+                    <pic:cNvPicPr/>
+                  </pic:nvPicPr>
+                  <pic:blipFill>
+                    <a:blip r:embed="rId19"/>
+                    <a:stretch>
+                      <a:fillRect/>
+                    </a:stretch>
+                  </pic:blipFill>
+                  <pic:spPr>
+                    <a:xfrm>
+                      <a:off x="0" y="0"/>
+                      <a:ext cx="5729605" cy="617855"/>
+                    </a:xfrm>
+                    <a:prstGeom prst="rect">
+                      <a:avLst/>
+                    </a:prstGeom>
+                  </pic:spPr>
+                </pic:pic>
+              </a:graphicData>
+            </a:graphic>
+          </wp:inline>
+        </w:drawing>
+      </w:r>
+    </w:p>
+    <w:p>
+      <w:r>
+        <w:t>So the output of findall is a list, which means I need to specify that I want the first number</w:t>
+      </w:r>
+      <w:r>
+        <w:t xml:space="preserve"> in the list [0]</w:t>
+      </w:r>
+    </w:p>
+    <w:p>
+      <w:hyperlink r:id="rId20" w:history="1">
+        <w:r>
+          <w:rPr>
+            <w:rStyle w:val="Hyperlink"/>
+          </w:rPr>
+          <w:t>https://stackoverflow.com/questions/4289331/how-to-extract-numbers-from-a-string-in-python</w:t>
+        </w:r>
+      </w:hyperlink>
+    </w:p>
+    <w:p>
+      <w:r>
+        <w:t>Working line to extract the output token integer from the –verbose string variable</w:t>
+      </w:r>
+    </w:p>
+    <w:p>
+      <w:r>
+        <w:drawing>
+          <wp:inline distT="0" distB="0" distL="0" distR="0" wp14:anchorId="1AD2C58F" wp14:editId="0BE0A8E2">
+            <wp:extent cx="5729605" cy="579755"/>
+            <wp:effectExtent l="0" t="0" r="4445" b="0"/>
+            <wp:docPr id="534718365" name="Picture 1"/>
+            <wp:cNvGraphicFramePr>
+              <a:graphicFrameLocks xmlns:a="http://schemas.openxmlformats.org/drawingml/2006/main" noChangeAspect="1"/>
+            </wp:cNvGraphicFramePr>
+            <a:graphic xmlns:a="http://schemas.openxmlformats.org/drawingml/2006/main">
+              <a:graphicData uri="http://schemas.openxmlformats.org/drawingml/2006/picture">
+                <pic:pic xmlns:pic="http://schemas.openxmlformats.org/drawingml/2006/picture">
+                  <pic:nvPicPr>
+                    <pic:cNvPr id="534718365" name=""/>
+                    <pic:cNvPicPr/>
+                  </pic:nvPicPr>
+                  <pic:blipFill>
+                    <a:blip r:embed="rId21"/>
+                    <a:stretch>
+                      <a:fillRect/>
+                    </a:stretch>
+                  </pic:blipFill>
+                  <pic:spPr>
+                    <a:xfrm>
+                      <a:off x="0" y="0"/>
+                      <a:ext cx="5729605" cy="579755"/>
+                    </a:xfrm>
+                    <a:prstGeom prst="rect">
+                      <a:avLst/>
+                    </a:prstGeom>
+                  </pic:spPr>
+                </pic:pic>
+              </a:graphicData>
+            </a:graphic>
+          </wp:inline>
+        </w:drawing>
+      </w:r>
+    </w:p>
+    <w:p>
+      <w:r>
+        <w:t>It successfully extracts the number that follows “eval count:” however, this will include the input token count “prompt eval count” (1) and display it as output token count “eval count” (2)</w:t>
+      </w:r>
+      <w:r>
+        <w:t xml:space="preserve"> so I have to find a way to extract the number following a string that ignores the previous “prompt” word.</w:t>
+      </w:r>
+    </w:p>
+    <w:p>
+      <w:r>
+        <w:drawing>
+          <wp:inline distT="0" distB="0" distL="0" distR="0" wp14:anchorId="5E1CCD44" wp14:editId="5FCA3F2E">
+            <wp:extent cx="2064979" cy="2218414"/>
+            <wp:effectExtent l="0" t="0" r="0" b="0"/>
+            <wp:docPr id="1674226837" name="Picture 1"/>
+            <wp:cNvGraphicFramePr>
+              <a:graphicFrameLocks xmlns:a="http://schemas.openxmlformats.org/drawingml/2006/main" noChangeAspect="1"/>
+            </wp:cNvGraphicFramePr>
+            <a:graphic xmlns:a="http://schemas.openxmlformats.org/drawingml/2006/main">
+              <a:graphicData uri="http://schemas.openxmlformats.org/drawingml/2006/picture">
+                <pic:pic xmlns:pic="http://schemas.openxmlformats.org/drawingml/2006/picture">
+                  <pic:nvPicPr>
+                    <pic:cNvPr id="1674226837" name=""/>
+                    <pic:cNvPicPr/>
+                  </pic:nvPicPr>
+                  <pic:blipFill>
+                    <a:blip r:embed="rId22"/>
+                    <a:stretch>
+                      <a:fillRect/>
+                    </a:stretch>
+                  </pic:blipFill>
+                  <pic:spPr>
+                    <a:xfrm>
+                      <a:off x="0" y="0"/>
+                      <a:ext cx="2067014" cy="2220600"/>
+                    </a:xfrm>
+                    <a:prstGeom prst="rect">
+                      <a:avLst/>
+                    </a:prstGeom>
+                  </pic:spPr>
+                </pic:pic>
+              </a:graphicData>
+            </a:graphic>
+          </wp:inline>
+        </w:drawing>
+      </w:r>
+    </w:p>
+    <w:p/>
+    <w:p/>
+    <w:p/>
+    <w:p/>
+    <w:p/>
+    <w:p/>
+    <w:p/>
+    <w:p/>
+    <w:p/>
+    <w:p>
+      <w:r>
+        <w:lastRenderedPageBreak/>
+        <w:t>The ^ symbol means the pattern has to start on a new line</w:t>
+      </w:r>
+      <w:r>
+        <w:t xml:space="preserve"> in MULTILINE mode (</w:t>
+      </w:r>
+      <w:hyperlink r:id="rId23" w:history="1">
+        <w:r>
+          <w:rPr>
+            <w:rStyle w:val="Hyperlink"/>
+          </w:rPr>
+          <w:t>https://docs.python.org/3/library/re.html</w:t>
+        </w:r>
+      </w:hyperlink>
+      <w:r>
+        <w:t>)</w:t>
+      </w:r>
+    </w:p>
+    <w:p>
+      <w:r>
+        <w:drawing>
+          <wp:inline distT="0" distB="0" distL="0" distR="0" wp14:anchorId="6FB5D029" wp14:editId="07016D82">
+            <wp:extent cx="5287617" cy="458264"/>
+            <wp:effectExtent l="0" t="0" r="0" b="0"/>
+            <wp:docPr id="2124030818" name="Picture 1"/>
+            <wp:cNvGraphicFramePr>
+              <a:graphicFrameLocks xmlns:a="http://schemas.openxmlformats.org/drawingml/2006/main" noChangeAspect="1"/>
+            </wp:cNvGraphicFramePr>
+            <a:graphic xmlns:a="http://schemas.openxmlformats.org/drawingml/2006/main">
+              <a:graphicData uri="http://schemas.openxmlformats.org/drawingml/2006/picture">
+                <pic:pic xmlns:pic="http://schemas.openxmlformats.org/drawingml/2006/picture">
+                  <pic:nvPicPr>
+                    <pic:cNvPr id="2124030818" name=""/>
+                    <pic:cNvPicPr/>
+                  </pic:nvPicPr>
+                  <pic:blipFill>
+                    <a:blip r:embed="rId24"/>
+                    <a:stretch>
+                      <a:fillRect/>
+                    </a:stretch>
+                  </pic:blipFill>
+                  <pic:spPr>
+                    <a:xfrm>
+                      <a:off x="0" y="0"/>
+                      <a:ext cx="5322184" cy="461260"/>
+                    </a:xfrm>
+                    <a:prstGeom prst="rect">
+                      <a:avLst/>
+                    </a:prstGeom>
+                  </pic:spPr>
+                </pic:pic>
+              </a:graphicData>
+            </a:graphic>
+          </wp:inline>
+        </w:drawing>
+      </w:r>
+    </w:p>
+    <w:p>
+      <w:r>
+        <w:t>This new code successfully only matches a string after a new line, and so finds the explicit “eval count” pattern.</w:t>
+      </w:r>
+    </w:p>
+    <w:p>
+      <w:r>
+        <w:drawing>
+          <wp:inline distT="0" distB="0" distL="0" distR="0" wp14:anchorId="2192E5CB" wp14:editId="644EA7EF">
+            <wp:extent cx="3299791" cy="2271779"/>
+            <wp:effectExtent l="0" t="0" r="0" b="0"/>
+            <wp:docPr id="2141465752" name="Picture 1"/>
+            <wp:cNvGraphicFramePr>
+              <a:graphicFrameLocks xmlns:a="http://schemas.openxmlformats.org/drawingml/2006/main" noChangeAspect="1"/>
+            </wp:cNvGraphicFramePr>
+            <a:graphic xmlns:a="http://schemas.openxmlformats.org/drawingml/2006/main">
+              <a:graphicData uri="http://schemas.openxmlformats.org/drawingml/2006/picture">
+                <pic:pic xmlns:pic="http://schemas.openxmlformats.org/drawingml/2006/picture">
+                  <pic:nvPicPr>
+                    <pic:cNvPr id="2141465752" name=""/>
+                    <pic:cNvPicPr/>
+                  </pic:nvPicPr>
+                  <pic:blipFill>
+                    <a:blip r:embed="rId25"/>
+                    <a:stretch>
+                      <a:fillRect/>
+                    </a:stretch>
+                  </pic:blipFill>
+                  <pic:spPr>
+                    <a:xfrm>
+                      <a:off x="0" y="0"/>
+                      <a:ext cx="3309972" cy="2278788"/>
+                    </a:xfrm>
+                    <a:prstGeom prst="rect">
+                      <a:avLst/>
+                    </a:prstGeom>
+                  </pic:spPr>
+                </pic:pic>
+              </a:graphicData>
+            </a:graphic>
+          </wp:inline>
+        </w:drawing>
+      </w:r>
+    </w:p>
+    <w:p>
+      <w:r>
+        <w:t>Yay it really works</w:t>
+      </w:r>
+    </w:p>
+    <w:p>
+      <w:r>
+        <w:drawing>
+          <wp:inline distT="0" distB="0" distL="0" distR="0" wp14:anchorId="1F747897" wp14:editId="03E75C39">
+            <wp:extent cx="3673502" cy="1525495"/>
+            <wp:effectExtent l="0" t="0" r="3175" b="0"/>
+            <wp:docPr id="1873886028" name="Picture 1"/>
+            <wp:cNvGraphicFramePr>
+              <a:graphicFrameLocks xmlns:a="http://schemas.openxmlformats.org/drawingml/2006/main" noChangeAspect="1"/>
+            </wp:cNvGraphicFramePr>
+            <a:graphic xmlns:a="http://schemas.openxmlformats.org/drawingml/2006/main">
+              <a:graphicData uri="http://schemas.openxmlformats.org/drawingml/2006/picture">
+                <pic:pic xmlns:pic="http://schemas.openxmlformats.org/drawingml/2006/picture">
+                  <pic:nvPicPr>
+                    <pic:cNvPr id="1873886028" name=""/>
+                    <pic:cNvPicPr/>
+                  </pic:nvPicPr>
+                  <pic:blipFill>
+                    <a:blip r:embed="rId26"/>
+                    <a:stretch>
+                      <a:fillRect/>
+                    </a:stretch>
+                  </pic:blipFill>
+                  <pic:spPr>
+                    <a:xfrm>
+                      <a:off x="0" y="0"/>
+                      <a:ext cx="3683172" cy="1529511"/>
+                    </a:xfrm>
+                    <a:prstGeom prst="rect">
+                      <a:avLst/>
+                    </a:prstGeom>
+                  </pic:spPr>
+                </pic:pic>
+              </a:graphicData>
+            </a:graphic>
+          </wp:inline>
+        </w:drawing>
+      </w:r>
+    </w:p>
+    <w:p>
+      <w:r>
+        <w:t>An issue I knew I would run into and took awhile to remedy is retrieving the token count for the main prompt, as I have to use “stdout” (2) to write to the main AI report (1) as f (3). And I cannot use “capture output”(4) to save the variable that saves the –verbose output as a variable (5) for processing into total token counts.</w:t>
+      </w:r>
+    </w:p>
+    <w:p>
+      <w:r>
+        <w:drawing>
+          <wp:inline distT="0" distB="0" distL="0" distR="0" wp14:anchorId="5BFCC321" wp14:editId="14E60CFE">
+            <wp:extent cx="6428109" cy="1184744"/>
+            <wp:effectExtent l="0" t="0" r="0" b="0"/>
+            <wp:docPr id="1792035481" name="Picture 1"/>
+            <wp:cNvGraphicFramePr>
+              <a:graphicFrameLocks xmlns:a="http://schemas.openxmlformats.org/drawingml/2006/main" noChangeAspect="1"/>
+            </wp:cNvGraphicFramePr>
+            <a:graphic xmlns:a="http://schemas.openxmlformats.org/drawingml/2006/main">
+              <a:graphicData uri="http://schemas.openxmlformats.org/drawingml/2006/picture">
+                <pic:pic xmlns:pic="http://schemas.openxmlformats.org/drawingml/2006/picture">
+                  <pic:nvPicPr>
+                    <pic:cNvPr id="1792035481" name=""/>
+                    <pic:cNvPicPr/>
+                  </pic:nvPicPr>
+                  <pic:blipFill>
+                    <a:blip r:embed="rId27"/>
+                    <a:stretch>
+                      <a:fillRect/>
+                    </a:stretch>
+                  </pic:blipFill>
+                  <pic:spPr>
+                    <a:xfrm>
+                      <a:off x="0" y="0"/>
+                      <a:ext cx="6444876" cy="1187834"/>
+                    </a:xfrm>
+                    <a:prstGeom prst="rect">
+                      <a:avLst/>
+                    </a:prstGeom>
+                  </pic:spPr>
+                </pic:pic>
+              </a:graphicData>
+            </a:graphic>
+          </wp:inline>
+        </w:drawing>
+      </w:r>
+    </w:p>
+    <w:p/>
+    <w:p/>
+    <w:p>
+      <w:pPr>
+        <w:ind w:left="0" w:firstLine="0"/>
+      </w:pPr>
+    </w:p>
+    <w:p>
+      <w:pPr>
+        <w:ind w:left="0" w:firstLine="0"/>
+      </w:pPr>
+      <w:r>
+        <w:lastRenderedPageBreak/>
+        <w:t>The solution was to write to the text file using stdout as f from outside of the subprocess task</w:t>
+      </w:r>
+    </w:p>
+    <w:p>
+      <w:pPr>
+        <w:ind w:left="0" w:firstLine="0"/>
+      </w:pPr>
+      <w:r>
+        <w:drawing>
+          <wp:inline distT="0" distB="0" distL="0" distR="0" wp14:anchorId="14F29B80" wp14:editId="1CB71F2E">
+            <wp:extent cx="5729605" cy="849630"/>
+            <wp:effectExtent l="0" t="0" r="4445" b="7620"/>
+            <wp:docPr id="451437205" name="Picture 1"/>
+            <wp:cNvGraphicFramePr>
+              <a:graphicFrameLocks xmlns:a="http://schemas.openxmlformats.org/drawingml/2006/main" noChangeAspect="1"/>
+            </wp:cNvGraphicFramePr>
+            <a:graphic xmlns:a="http://schemas.openxmlformats.org/drawingml/2006/main">
+              <a:graphicData uri="http://schemas.openxmlformats.org/drawingml/2006/picture">
+                <pic:pic xmlns:pic="http://schemas.openxmlformats.org/drawingml/2006/picture">
+                  <pic:nvPicPr>
+                    <pic:cNvPr id="451437205" name=""/>
+                    <pic:cNvPicPr/>
+                  </pic:nvPicPr>
+                  <pic:blipFill>
+                    <a:blip r:embed="rId28"/>
+                    <a:stretch>
+                      <a:fillRect/>
+                    </a:stretch>
+                  </pic:blipFill>
+                  <pic:spPr>
+                    <a:xfrm>
+                      <a:off x="0" y="0"/>
+                      <a:ext cx="5729605" cy="849630"/>
+                    </a:xfrm>
+                    <a:prstGeom prst="rect">
+                      <a:avLst/>
+                    </a:prstGeom>
+                  </pic:spPr>
+                </pic:pic>
+              </a:graphicData>
+            </a:graphic>
+          </wp:inline>
+        </w:drawing>
+      </w:r>
+    </w:p>
+    <w:p>
+      <w:r>
+        <w:t>Script successfully both writes to the AI report of the summarised chunks from stdout(2) and saves the tokens from the stderr of all 3 prompts (1) although it seems like maybe prompt 1 and 2 are taking their token count from the same place</w:t>
+      </w:r>
+      <w:r>
+        <w:t>, or they just happen to be identical</w:t>
+      </w:r>
+      <w:r>
+        <w:t xml:space="preserve"> (will troubleshoot)</w:t>
+      </w:r>
+    </w:p>
+    <w:p>
+      <w:r>
+        <w:drawing>
+          <wp:inline distT="0" distB="0" distL="0" distR="0" wp14:anchorId="4778999E" wp14:editId="36722A46">
+            <wp:extent cx="5526156" cy="4353310"/>
+            <wp:effectExtent l="0" t="0" r="0" b="9525"/>
+            <wp:docPr id="299268039" name="Picture 1"/>
+            <wp:cNvGraphicFramePr>
+              <a:graphicFrameLocks xmlns:a="http://schemas.openxmlformats.org/drawingml/2006/main" noChangeAspect="1"/>
+            </wp:cNvGraphicFramePr>
+            <a:graphic xmlns:a="http://schemas.openxmlformats.org/drawingml/2006/main">
+              <a:graphicData uri="http://schemas.openxmlformats.org/drawingml/2006/picture">
+                <pic:pic xmlns:pic="http://schemas.openxmlformats.org/drawingml/2006/picture">
+                  <pic:nvPicPr>
+                    <pic:cNvPr id="299268039" name=""/>
+                    <pic:cNvPicPr/>
+                  </pic:nvPicPr>
+                  <pic:blipFill>
+                    <a:blip r:embed="rId29"/>
+                    <a:stretch>
+                      <a:fillRect/>
+                    </a:stretch>
+                  </pic:blipFill>
+                  <pic:spPr>
+                    <a:xfrm>
+                      <a:off x="0" y="0"/>
+                      <a:ext cx="5528420" cy="4355093"/>
+                    </a:xfrm>
+                    <a:prstGeom prst="rect">
+                      <a:avLst/>
+                    </a:prstGeom>
+                  </pic:spPr>
+                </pic:pic>
+              </a:graphicData>
+            </a:graphic>
+          </wp:inline>
+        </w:drawing>
+      </w:r>
+    </w:p>
+    <w:p/>
+    <w:p/>
+    <w:p/>
+    <w:p/>
+    <w:p/>
+    <w:p/>
+    <w:p/>
+    <w:p/>
+    <w:p>
+      <w:r>
+        <w:lastRenderedPageBreak/>
+        <w:t>As suspected, the token counts for the first prompt (1) appear to pass via stderror extraction to both prompt 1’s token count (2) and prompt 2’s token count (3) despite the output tokens being only 445 for prompt 2 (4)</w:t>
+      </w:r>
+    </w:p>
+    <w:p>
+      <w:r>
+        <w:drawing>
+          <wp:inline distT="0" distB="0" distL="0" distR="0" wp14:anchorId="63746481" wp14:editId="659D88D6">
+            <wp:extent cx="4731026" cy="4151642"/>
+            <wp:effectExtent l="0" t="0" r="0" b="1270"/>
+            <wp:docPr id="2065432976" name="Picture 1"/>
+            <wp:cNvGraphicFramePr>
+              <a:graphicFrameLocks xmlns:a="http://schemas.openxmlformats.org/drawingml/2006/main" noChangeAspect="1"/>
+            </wp:cNvGraphicFramePr>
+            <a:graphic xmlns:a="http://schemas.openxmlformats.org/drawingml/2006/main">
+              <a:graphicData uri="http://schemas.openxmlformats.org/drawingml/2006/picture">
+                <pic:pic xmlns:pic="http://schemas.openxmlformats.org/drawingml/2006/picture">
+                  <pic:nvPicPr>
+                    <pic:cNvPr id="2065432976" name=""/>
+                    <pic:cNvPicPr/>
+                  </pic:nvPicPr>
+                  <pic:blipFill>
+                    <a:blip r:embed="rId30"/>
+                    <a:stretch>
+                      <a:fillRect/>
+                    </a:stretch>
+                  </pic:blipFill>
+                  <pic:spPr>
+                    <a:xfrm>
+                      <a:off x="0" y="0"/>
+                      <a:ext cx="4734474" cy="4154668"/>
+                    </a:xfrm>
+                    <a:prstGeom prst="rect">
+                      <a:avLst/>
+                    </a:prstGeom>
+                  </pic:spPr>
+                </pic:pic>
+              </a:graphicData>
+            </a:graphic>
+          </wp:inline>
+        </w:drawing>
+      </w:r>
+    </w:p>
+    <w:p>
+      <w:r>
+        <w:t>Oh woops I was printing prompt 1’s output tokens again, silly me copy pasting.</w:t>
+      </w:r>
+    </w:p>
+    <w:p>
+      <w:r>
+        <w:drawing>
+          <wp:inline distT="0" distB="0" distL="0" distR="0" wp14:anchorId="609B44C1" wp14:editId="72F6D2D0">
+            <wp:extent cx="4770782" cy="814782"/>
+            <wp:effectExtent l="0" t="0" r="0" b="4445"/>
+            <wp:docPr id="852471157" name="Picture 1"/>
+            <wp:cNvGraphicFramePr>
+              <a:graphicFrameLocks xmlns:a="http://schemas.openxmlformats.org/drawingml/2006/main" noChangeAspect="1"/>
+            </wp:cNvGraphicFramePr>
+            <a:graphic xmlns:a="http://schemas.openxmlformats.org/drawingml/2006/main">
+              <a:graphicData uri="http://schemas.openxmlformats.org/drawingml/2006/picture">
+                <pic:pic xmlns:pic="http://schemas.openxmlformats.org/drawingml/2006/picture">
+                  <pic:nvPicPr>
+                    <pic:cNvPr id="852471157" name=""/>
+                    <pic:cNvPicPr/>
+                  </pic:nvPicPr>
+                  <pic:blipFill>
+                    <a:blip r:embed="rId31"/>
+                    <a:stretch>
+                      <a:fillRect/>
+                    </a:stretch>
+                  </pic:blipFill>
+                  <pic:spPr>
+                    <a:xfrm>
+                      <a:off x="0" y="0"/>
+                      <a:ext cx="4772410" cy="815060"/>
+                    </a:xfrm>
+                    <a:prstGeom prst="rect">
+                      <a:avLst/>
+                    </a:prstGeom>
+                  </pic:spPr>
+                </pic:pic>
+              </a:graphicData>
+            </a:graphic>
+          </wp:inline>
+        </w:drawing>
+      </w:r>
+    </w:p>
+    <w:p>
+      <w:r>
+        <w:t>Script working as intended, with I/O token counts, now I just need to have them add together</w:t>
+      </w:r>
+      <w:r>
+        <w:t xml:space="preserve"> and leave the function.</w:t>
+      </w:r>
+    </w:p>
+    <w:p>
+      <w:r>
+        <w:drawing>
+          <wp:inline distT="0" distB="0" distL="0" distR="0" wp14:anchorId="184FF4D3" wp14:editId="27C8E1DA">
+            <wp:extent cx="3697356" cy="2136131"/>
+            <wp:effectExtent l="0" t="0" r="0" b="0"/>
+            <wp:docPr id="343922417" name="Picture 1"/>
+            <wp:cNvGraphicFramePr>
+              <a:graphicFrameLocks xmlns:a="http://schemas.openxmlformats.org/drawingml/2006/main" noChangeAspect="1"/>
+            </wp:cNvGraphicFramePr>
+            <a:graphic xmlns:a="http://schemas.openxmlformats.org/drawingml/2006/main">
+              <a:graphicData uri="http://schemas.openxmlformats.org/drawingml/2006/picture">
+                <pic:pic xmlns:pic="http://schemas.openxmlformats.org/drawingml/2006/picture">
+                  <pic:nvPicPr>
+                    <pic:cNvPr id="343922417" name=""/>
+                    <pic:cNvPicPr/>
+                  </pic:nvPicPr>
+                  <pic:blipFill>
+                    <a:blip r:embed="rId32"/>
+                    <a:stretch>
+                      <a:fillRect/>
+                    </a:stretch>
+                  </pic:blipFill>
+                  <pic:spPr>
+                    <a:xfrm>
+                      <a:off x="0" y="0"/>
+                      <a:ext cx="3732873" cy="2156651"/>
+                    </a:xfrm>
+                    <a:prstGeom prst="rect">
+                      <a:avLst/>
+                    </a:prstGeom>
+                  </pic:spPr>
+                </pic:pic>
+              </a:graphicData>
+            </a:graphic>
+          </wp:inline>
+        </w:drawing>
+      </w:r>
+    </w:p>
+    <w:p>
+      <w:r>
+        <w:lastRenderedPageBreak/>
+        <w:t>Added lines to add together the total input and output token counts as variables, then send them outside the function.</w:t>
+      </w:r>
+    </w:p>
+    <w:p>
+      <w:r>
+        <w:drawing>
+          <wp:inline distT="0" distB="0" distL="0" distR="0" wp14:anchorId="6AD21A66" wp14:editId="194BBDBB">
+            <wp:extent cx="3648584" cy="523948"/>
+            <wp:effectExtent l="0" t="0" r="9525" b="9525"/>
+            <wp:docPr id="773738019" name="Picture 1"/>
+            <wp:cNvGraphicFramePr>
+              <a:graphicFrameLocks xmlns:a="http://schemas.openxmlformats.org/drawingml/2006/main" noChangeAspect="1"/>
+            </wp:cNvGraphicFramePr>
+            <a:graphic xmlns:a="http://schemas.openxmlformats.org/drawingml/2006/main">
+              <a:graphicData uri="http://schemas.openxmlformats.org/drawingml/2006/picture">
+                <pic:pic xmlns:pic="http://schemas.openxmlformats.org/drawingml/2006/picture">
+                  <pic:nvPicPr>
+                    <pic:cNvPr id="773738019" name=""/>
+                    <pic:cNvPicPr/>
+                  </pic:nvPicPr>
+                  <pic:blipFill>
+                    <a:blip r:embed="rId33"/>
+                    <a:stretch>
+                      <a:fillRect/>
+                    </a:stretch>
+                  </pic:blipFill>
+                  <pic:spPr>
+                    <a:xfrm>
+                      <a:off x="0" y="0"/>
+                      <a:ext cx="3648584" cy="523948"/>
+                    </a:xfrm>
+                    <a:prstGeom prst="rect">
+                      <a:avLst/>
+                    </a:prstGeom>
+                  </pic:spPr>
+                </pic:pic>
+              </a:graphicData>
+            </a:graphic>
+          </wp:inline>
+        </w:drawing>
+      </w:r>
+    </w:p>
+    <w:p>
+      <w:r>
+        <w:t>Outside of the function, have the script receive these variables when calling it (1) then print the total input, output, and calculated overall sum token count.</w:t>
+      </w:r>
+    </w:p>
+    <w:p>
+      <w:r>
+        <w:drawing>
+          <wp:inline distT="0" distB="0" distL="0" distR="0" wp14:anchorId="72757BC8" wp14:editId="4FC8F751">
+            <wp:extent cx="4667415" cy="2052685"/>
+            <wp:effectExtent l="0" t="0" r="0" b="5080"/>
+            <wp:docPr id="398075278" name="Picture 1"/>
+            <wp:cNvGraphicFramePr>
+              <a:graphicFrameLocks xmlns:a="http://schemas.openxmlformats.org/drawingml/2006/main" noChangeAspect="1"/>
+            </wp:cNvGraphicFramePr>
+            <a:graphic xmlns:a="http://schemas.openxmlformats.org/drawingml/2006/main">
+              <a:graphicData uri="http://schemas.openxmlformats.org/drawingml/2006/picture">
+                <pic:pic xmlns:pic="http://schemas.openxmlformats.org/drawingml/2006/picture">
+                  <pic:nvPicPr>
+                    <pic:cNvPr id="398075278" name=""/>
+                    <pic:cNvPicPr/>
+                  </pic:nvPicPr>
+                  <pic:blipFill>
+                    <a:blip r:embed="rId34"/>
+                    <a:stretch>
+                      <a:fillRect/>
+                    </a:stretch>
+                  </pic:blipFill>
+                  <pic:spPr>
+                    <a:xfrm>
+                      <a:off x="0" y="0"/>
+                      <a:ext cx="4673701" cy="2055449"/>
+                    </a:xfrm>
+                    <a:prstGeom prst="rect">
+                      <a:avLst/>
+                    </a:prstGeom>
+                  </pic:spPr>
+                </pic:pic>
+              </a:graphicData>
+            </a:graphic>
+          </wp:inline>
+        </w:drawing>
+      </w:r>
+    </w:p>
+    <w:p>
+      <w:r>
+        <w:t>I also created a backup for all the existing scripts so far and moved them to the github.</w:t>
+      </w:r>
     </w:p>
     <w:sectPr>
-      <w:headerReference w:type="default" r:id="rId9"/>
-      <w:footerReference w:type="even" r:id="rId10"/>
-      <w:footerReference w:type="default" r:id="rId11"/>
-      <w:footerReference w:type="first" r:id="rId12"/>
+      <w:headerReference w:type="default" r:id="rId35"/>
+      <w:footerReference w:type="even" r:id="rId36"/>
+      <w:footerReference w:type="default" r:id="rId37"/>
+      <w:footerReference w:type="first" r:id="rId38"/>
       <w:pgSz w:w="11906" w:h="16838"/>
       <w:pgMar w:top="1483" w:right="1448" w:bottom="1544" w:left="1435" w:header="720" w:footer="730" w:gutter="0"/>
       <w:pgNumType w:start="0"/>

</xml_diff>

<commit_message>
updated logs, added folders for AI reports, updated forensic file tracking excel
</commit_message>
<xml_diff>
--- a/Weekly Logs/Matt/Matt Baker - Week 10 Individual Logbook.docx
+++ b/Weekly Logs/Matt/Matt Baker - Week 10 Individual Logbook.docx
@@ -2840,10 +2840,56 @@
     </w:p>
     <w:p>
       <w:pPr>
+        <w:rPr>
+          <w:rStyle w:val="Heading2Char"/>
+          <w:color w:val="000000"/>
+          <w:sz w:val="22"/>
+        </w:rPr>
+      </w:pPr>
+    </w:p>
+    <w:p>
+      <w:pPr>
+        <w:rPr>
+          <w:rStyle w:val="Heading2Char"/>
+          <w:color w:val="000000"/>
+          <w:sz w:val="22"/>
+        </w:rPr>
+      </w:pPr>
+    </w:p>
+    <w:p>
+      <w:pPr>
+        <w:rPr>
+          <w:rStyle w:val="Heading2Char"/>
+          <w:color w:val="000000"/>
+          <w:sz w:val="22"/>
+        </w:rPr>
+      </w:pPr>
+    </w:p>
+    <w:p>
+      <w:pPr>
+        <w:rPr>
+          <w:rStyle w:val="Heading2Char"/>
+          <w:color w:val="000000"/>
+          <w:sz w:val="22"/>
+        </w:rPr>
+      </w:pPr>
+    </w:p>
+    <w:p>
+      <w:pPr>
+        <w:rPr>
+          <w:rStyle w:val="Heading2Char"/>
+          <w:color w:val="000000"/>
+          <w:sz w:val="22"/>
+        </w:rPr>
+      </w:pPr>
+    </w:p>
+    <w:p>
+      <w:pPr>
         <w:pStyle w:val="Heading2"/>
       </w:pPr>
       <w:bookmarkStart w:id="5" w:name="_Toc240451467"/>
       <w:r>
+        <w:lastRenderedPageBreak/>
         <w:t>Client Meetings</w:t>
       </w:r>
       <w:bookmarkEnd w:id="5"/>
@@ -2918,7 +2964,6 @@
       </w:pPr>
       <w:bookmarkStart w:id="6" w:name="_Toc240451468"/>
       <w:r>
-        <w:lastRenderedPageBreak/>
         <w:t>Research</w:t>
       </w:r>
       <w:bookmarkEnd w:id="6"/>
@@ -3055,6 +3100,7 @@
         <w:rPr>
           <w:noProof/>
         </w:rPr>
+        <w:lastRenderedPageBreak/>
         <w:drawing>
           <wp:inline distT="0" distB="0" distL="0" distR="0" wp14:anchorId="4C0FFEFB" wp14:editId="57C606B6">
             <wp:extent cx="3286125" cy="2136307"/>
@@ -3116,7 +3162,6 @@
         <w:rPr>
           <w:noProof/>
         </w:rPr>
-        <w:lastRenderedPageBreak/>
         <w:drawing>
           <wp:inline distT="0" distB="0" distL="0" distR="0" wp14:anchorId="42D61827" wp14:editId="3C00C021">
             <wp:extent cx="5978718" cy="1219200"/>
@@ -3253,6 +3298,7 @@
     </w:p>
     <w:p>
       <w:r>
+        <w:lastRenderedPageBreak/>
         <w:t>Only information I can find is that in container env, ollama outputs logs to stderr, which must include diagnostic info such as token counts.</w:t>
       </w:r>
     </w:p>
@@ -3312,7 +3358,6 @@
     </w:p>
     <w:p>
       <w:r>
-        <w:lastRenderedPageBreak/>
         <w:t>Saturday, September 19</w:t>
       </w:r>
     </w:p>
@@ -3384,6 +3429,7 @@
         <w:rPr>
           <w:noProof/>
         </w:rPr>
+        <w:lastRenderedPageBreak/>
         <w:drawing>
           <wp:inline distT="0" distB="0" distL="0" distR="0" wp14:anchorId="67E429C8" wp14:editId="1142B93E">
             <wp:extent cx="5729605" cy="3260725"/>
@@ -3427,7 +3473,6 @@
     <w:p/>
     <w:p>
       <w:r>
-        <w:lastRenderedPageBreak/>
         <w:t>Sunday, September 2</w:t>
       </w:r>
       <w:r>
@@ -3476,6 +3521,7 @@
         <w:rPr>
           <w:noProof/>
         </w:rPr>
+        <w:lastRenderedPageBreak/>
         <w:drawing>
           <wp:inline distT="0" distB="0" distL="0" distR="0" wp14:anchorId="737BDD64" wp14:editId="10C8D17D">
             <wp:extent cx="4638675" cy="3126723"/>
@@ -3567,7 +3613,6 @@
     <w:p/>
     <w:p>
       <w:r>
-        <w:lastRenderedPageBreak/>
         <w:t>I also test the effects of different flags of the Linux “split” command, specifically on my .84 nmap scan which I know directly splits through a host name.</w:t>
       </w:r>
     </w:p>
@@ -3584,6 +3629,7 @@
         <w:rPr>
           <w:noProof/>
         </w:rPr>
+        <w:lastRenderedPageBreak/>
         <w:drawing>
           <wp:inline distT="0" distB="0" distL="0" distR="0" wp14:anchorId="2D092C62" wp14:editId="5F017139">
             <wp:extent cx="5729605" cy="1497330"/>
@@ -3684,63 +3730,66 @@
       </w:pPr>
       <w:bookmarkStart w:id="9" w:name="_Toc240451471"/>
       <w:r>
+        <w:t>Development</w:t>
+      </w:r>
+      <w:bookmarkEnd w:id="9"/>
+    </w:p>
+    <w:p>
+      <w:r>
+        <w:t>Saturday</w:t>
+      </w:r>
+      <w:r>
+        <w:t>, September 1</w:t>
+      </w:r>
+      <w:r>
+        <w:t>9</w:t>
+      </w:r>
+    </w:p>
+    <w:p>
+      <w:r>
+        <w:t xml:space="preserve">4:00PM </w:t>
+      </w:r>
+      <w:r>
+        <w:t>–</w:t>
+      </w:r>
+      <w:r>
+        <w:t xml:space="preserve"> </w:t>
+      </w:r>
+      <w:r>
+        <w:t>9</w:t>
+      </w:r>
+      <w:r>
+        <w:t>:</w:t>
+      </w:r>
+      <w:r>
+        <w:t>15</w:t>
+      </w:r>
+      <w:r>
+        <w:t>PM (</w:t>
+      </w:r>
+      <w:r>
+        <w:t>5</w:t>
+      </w:r>
+      <w:r>
+        <w:t>hrs</w:t>
+      </w:r>
+      <w:r>
+        <w:t xml:space="preserve"> 15 min</w:t>
+      </w:r>
+      <w:r>
+        <w:t>)</w:t>
+      </w:r>
+    </w:p>
+    <w:p>
+      <w:r>
+        <w:t>Development on SilentCartographerV1, adding up the input and output token counts for each promp</w:t>
+      </w:r>
+      <w:r>
+        <w:t xml:space="preserve">t. The –verbose output from ollama is in string format so I had to figure out how to convert </w:t>
+      </w:r>
+      <w:r>
         <w:lastRenderedPageBreak/>
-        <w:t>Development</w:t>
-      </w:r>
-      <w:bookmarkEnd w:id="9"/>
-    </w:p>
-    <w:p>
-      <w:r>
-        <w:t>Saturday</w:t>
-      </w:r>
-      <w:r>
-        <w:t>, September 1</w:t>
-      </w:r>
-      <w:r>
-        <w:t>9</w:t>
-      </w:r>
-    </w:p>
-    <w:p>
-      <w:r>
-        <w:t xml:space="preserve">4:00PM </w:t>
-      </w:r>
-      <w:r>
-        <w:t>–</w:t>
-      </w:r>
-      <w:r>
-        <w:t xml:space="preserve"> </w:t>
-      </w:r>
-      <w:r>
-        <w:t>9</w:t>
-      </w:r>
-      <w:r>
-        <w:t>:</w:t>
-      </w:r>
-      <w:r>
-        <w:t>15</w:t>
-      </w:r>
-      <w:r>
-        <w:t>PM (</w:t>
-      </w:r>
-      <w:r>
-        <w:t>5</w:t>
-      </w:r>
-      <w:r>
-        <w:t>hrs</w:t>
-      </w:r>
-      <w:r>
-        <w:t xml:space="preserve"> 15 min</w:t>
-      </w:r>
-      <w:r>
-        <w:t>)</w:t>
-      </w:r>
-    </w:p>
-    <w:p>
-      <w:r>
-        <w:t>Development on SilentCartographerV1, adding up the input and output token counts for each promp</w:t>
-      </w:r>
-      <w:r>
-        <w:t>t. The –verbose output from ollama is in string format so I had to figure out how to convert just the parts I want (eval and prompt_eval) token counts and add them together using “re”</w:t>
+        <w:t>just the parts I want (eval and prompt_eval) token counts and add them together using “re”</w:t>
       </w:r>
       <w:r>
         <w:t xml:space="preserve"> for regular expression modules</w:t>
@@ -3866,7 +3915,6 @@
     <w:p/>
     <w:p>
       <w:r>
-        <w:lastRenderedPageBreak/>
         <w:t>Also got this error, due to my command using “findall” which looks for the target data in lists I believe?</w:t>
       </w:r>
       <w:r>
@@ -3917,6 +3965,7 @@
     </w:p>
     <w:p>
       <w:r>
+        <w:lastRenderedPageBreak/>
         <w:t>So the output of findall is a list, which means I need to specify that I want the first number</w:t>
       </w:r>
       <w:r>
@@ -4041,7 +4090,6 @@
     <w:p/>
     <w:p>
       <w:r>
-        <w:lastRenderedPageBreak/>
         <w:t xml:space="preserve">The ^ symbol means the </w:t>
       </w:r>
       <w:r>
@@ -4117,6 +4165,7 @@
         <w:rPr>
           <w:noProof/>
         </w:rPr>
+        <w:lastRenderedPageBreak/>
         <w:drawing>
           <wp:inline distT="0" distB="0" distL="0" distR="0" wp14:anchorId="2192E5CB" wp14:editId="644EA7EF">
             <wp:extent cx="3299791" cy="2271779"/>
@@ -4260,7 +4309,6 @@
         <w:ind w:left="0" w:firstLine="0"/>
       </w:pPr>
       <w:r>
-        <w:lastRenderedPageBreak/>
         <w:t>The solution was to write to the text file using stdout as f from outside of the subprocess task</w:t>
       </w:r>
     </w:p>
@@ -4311,6 +4359,7 @@
     </w:p>
     <w:p>
       <w:r>
+        <w:lastRenderedPageBreak/>
         <w:t>Script successfully both writes to the AI report of the summarised chunks from stdout(2) and saves the tokens from the stderr of all 3 prompts (1) although it seems like maybe prompt 1 and 2 are taking their token count from the same place</w:t>
       </w:r>
       <w:r>
@@ -4372,7 +4421,6 @@
     <w:p/>
     <w:p>
       <w:r>
-        <w:lastRenderedPageBreak/>
         <w:t>As suspected, the token counts for the first prompt (1) appear to pass via stderror extraction to both prompt 1’s token count (2) and prompt 2’s token count (3) despite the output tokens being only 445 for prompt 2 (4)</w:t>
       </w:r>
     </w:p>
@@ -4381,6 +4429,7 @@
         <w:rPr>
           <w:noProof/>
         </w:rPr>
+        <w:lastRenderedPageBreak/>
         <w:drawing>
           <wp:inline distT="0" distB="0" distL="0" distR="0" wp14:anchorId="63746481" wp14:editId="659D88D6">
             <wp:extent cx="4731026" cy="4151642"/>
@@ -4517,7 +4566,6 @@
     </w:p>
     <w:p>
       <w:r>
-        <w:lastRenderedPageBreak/>
         <w:t>Added lines to add together the total input and output token counts as variables, then send them outside the function.</w:t>
       </w:r>
     </w:p>
@@ -4526,6 +4574,7 @@
         <w:rPr>
           <w:noProof/>
         </w:rPr>
+        <w:lastRenderedPageBreak/>
         <w:drawing>
           <wp:inline distT="0" distB="0" distL="0" distR="0" wp14:anchorId="6AD21A66" wp14:editId="194BBDBB">
             <wp:extent cx="3648584" cy="523948"/>
@@ -4673,38 +4722,38 @@
         </w:rPr>
       </w:pPr>
       <w:r>
+        <w:t>Sunday, September 20</w:t>
+      </w:r>
+    </w:p>
+    <w:p>
+      <w:r>
+        <w:t xml:space="preserve">4:15 – </w:t>
+      </w:r>
+      <w:r>
+        <w:t>6</w:t>
+      </w:r>
+      <w:r>
+        <w:t>:30 (</w:t>
+      </w:r>
+      <w:r>
+        <w:t>2</w:t>
+      </w:r>
+      <w:r>
+        <w:t>hr</w:t>
+      </w:r>
+      <w:r>
+        <w:t>s</w:t>
+      </w:r>
+      <w:r>
+        <w:t xml:space="preserve"> 15 mins)</w:t>
+      </w:r>
+    </w:p>
+    <w:p>
+      <w:pPr>
+        <w:ind w:left="0" w:firstLine="0"/>
+      </w:pPr>
+      <w:r>
         <w:lastRenderedPageBreak/>
-        <w:t>Sunday, September 20</w:t>
-      </w:r>
-    </w:p>
-    <w:p>
-      <w:r>
-        <w:t xml:space="preserve">4:15 – </w:t>
-      </w:r>
-      <w:r>
-        <w:t>6</w:t>
-      </w:r>
-      <w:r>
-        <w:t>:30 (</w:t>
-      </w:r>
-      <w:r>
-        <w:t>2</w:t>
-      </w:r>
-      <w:r>
-        <w:t>hr</w:t>
-      </w:r>
-      <w:r>
-        <w:t>s</w:t>
-      </w:r>
-      <w:r>
-        <w:t xml:space="preserve"> 15 mins)</w:t>
-      </w:r>
-    </w:p>
-    <w:p>
-      <w:pPr>
-        <w:ind w:left="0" w:firstLine="0"/>
-      </w:pPr>
-      <w:r>
         <w:t xml:space="preserve">Development </w:t>
       </w:r>
       <w:r>

</xml_diff>